<commit_message>
Add BSC-UNet-P (quadratic-phase beam shortcut), fix LR schedule, kappa/shadow checks
- csi_models.py: BeamShortcutPolyUNet (BSC-UNet-P), poly2_extrapolate
- train_beam.py: cosine LR holds lr_min after cosine_epochs (no restart),
  --poly_shortcut, --doppler_rate_kappa, result.json records epochs_trained/best_epoch
- data.py / evaluate.py: rescale_doppler_rate (Doppler-rate scale sensitivity)
- Retrained v9b BSC-UNet-I (k=1,2,4) with fixed LR; kappa=1 sensitivity runs
- check_shadow_invariance.py, eval_bearing_final.py, make_tables_final.py
- Equation document updated for BSC-UNet-P

Co-Authored-By: Claude Opus 5.5 <noreply@anthropic.com>
</commit_message>
<xml_diff>
--- a/docs/BSC-UNet_수식정리.docx
+++ b/docs/BSC-UNet_수식정리.docx
@@ -7,7 +7,7 @@
         <w:pStyle w:val="Title"/>
       </w:pPr>
       <w:r>
-        <w:t>LEO NTN Ka-band FDD 하향링크 CSI 예측: 데이터 생성 · BSC-UNet · 비교 기법 · 평가 수식 정리</w:t>
+        <w:t>LEO NTN Ka-band FDD 하향링크 CSI 예측: 데이터 생성 · BSC-UNet-P · 비교 기법 · 평가 수식 정리</w:t>
       </w:r>
     </w:p>
     <w:p>
@@ -16,7 +16,7 @@
           <w:rFonts w:ascii="Malgun Gothic" w:hAnsi="Malgun Gothic" w:eastAsia="Malgun Gothic"/>
           <w:sz w:val="21"/>
         </w:rPr>
-        <w:t>모든 수식은 실제 구현과 기호·정의가 일치하도록 작성했다. 각 수식 아래 회색 글씨는 PowerPoint 수식 편집기(삽입 → 수식 → LaTeX 형식)에 그대로 붙여 넣을 수 있는 LaTeX 코드이고, ‘구현’은 대응하는 파일·함수다. 주 결과는 v9b 데이터(위성 기준 방위각 0° 고정), 확장 결과는 v10 데이터(구면 궤도 기하, 10절)이다.</w:t>
+        <w:t>모든 수식은 실제 구현과 기호·정의가 일치하도록 작성했다. 각 수식 아래 회색 글씨는 PowerPoint 수식 편집기(삽입 → 수식 → LaTeX 형식)에 그대로 붙여 넣을 수 있는 LaTeX 코드이고, ‘구현’은 대응하는 파일·함수다. 데이터는 v9b (위성 기준 방위각 0° 고정)이고, 제안 모델은 BSC-UNet-P다.</w:t>
       </w:r>
     </w:p>
     <w:p>
@@ -1387,7 +1387,7 @@
           <w:rFonts w:ascii="Malgun Gothic" w:hAnsi="Malgun Gothic" w:eastAsia="Malgun Gothic"/>
           <w:sz w:val="21"/>
         </w:rPr>
-        <w:t>Shadow fading / NLOS clutter loss (Table 6.6.2-2, Ka-band): LOS는 μ_SF = 0, σ_SF = 4 dB, NLOS는 μ_SF = CL(ε) (44.3 dB@10° ~ 32.9 dB@90°), σ_SF = 6 dB.</w:t>
+        <w:t>Shadow fading / NLOS clutter loss (Table 6.6.2-2, Ka-band): LOS는 μ_SF = 0, σ_SF = 4 dB, NLOS는 μ_SF = CL(ε) (44.3 dB@10° ~ 32.9 dB@90°), σ_SF = 6 dB. TR 38.811의 shadow fading은 평균 0의 로그정규(이득·감쇠 양방향)이지만, 구현은 max(0, ·)로 잘라 감쇠 방향만 반영한다 (v9b LOS 에피소드의 약 절반이 0 dB: train 78/159, val 22/44, test 22/43, guard 25/53; NLOS는 평균 34–40 dB로 잘림 없음).</w:t>
       </w:r>
     </w:p>
     <w:p>
@@ -2497,7 +2497,7 @@
           <w:rFonts w:ascii="Malgun Gothic" w:hAnsi="Malgun Gothic" w:eastAsia="Malgun Gothic"/>
           <w:sz w:val="21"/>
         </w:rPr>
-        <w:t>관측 i마다 시각 tᵢ의 슬롯 하나만 생성하고(InitialTime = tᵢ), 경로 이득에 4절의 위상 항 ψ(t)를 곱한 뒤 완전 채널 추정으로 주파수 응답을 얻는다. τ₀는 에피소드 첫 관측에서 한 번 추정해 고정한 타이밍 오프셋(v9b)이다. 고정 오프셋이므로 관측 간 부반송파 위상 기울기 점프가 없다 (로더의 점프 보정은 v9b 전 split에서 0건 작동). 아래는 경로 필터의 대역 제한을 무시한 근사식이며 구현은 nrPerfectChannelEstimate의 정확한 계산이다.</w:t>
+        <w:t>관측 i마다 시각 tᵢ의 슬롯 하나만 생성하고(InitialTime = tᵢ), 경로 이득에 4절의 위상 항 ψ(t)를 곱한 뒤 완전 채널 추정으로 주파수 응답을 얻는다. τ₀는 에피소드 첫 관측에서 한 번 추정해 고정한 타이밍 오프셋(v9b)이다. 고정 오프셋이므로 관측 간 부반송파 위상 기울기 점프가 없다 (로더의 점프 보정 fix_timing_jumps는 기본으로 켜져 있으나 v9b 전 split의 모든 관측에서 보정량 0 — 사실상 보정 없음). 아래는 경로 필터의 대역 제한을 무시한 근사식이며 구현은 nrPerfectChannelEstimate의 정확한 계산이다.</w:t>
       </w:r>
     </w:p>
     <w:p>
@@ -3628,7 +3628,7 @@
           <w:rFonts w:ascii="Malgun Gothic" w:hAnsi="Malgun Gothic" w:eastAsia="Malgun Gothic"/>
           <w:sz w:val="21"/>
         </w:rPr>
-        <w:t>미분은 Δθ = 10⁻⁵ rad 중앙 차분이다. 샘플링 Nyquist(1/(2Δt) = 500 Hz) 여유를 위해 에피소드 말미 잔차 순간주파수가 150 Hz를 넘지 않도록, 최악 조건 ε = 90° 기준 전역 스케일을 한 번만 정해 모든 에피소드에 같은 비율로 적용한다 (고각별 상대 차이 보존, f_D^raw(90°) = −6449.3 Hz/s). π ḟ_D t²는 선형 위상 램프(상수 회전)로 제거되지 않는 2차 위상이다.</w:t>
+        <w:t>미분은 Δθ = 10⁻⁵ rad 중앙 차분이다. 구현은 에피소드 말미 잔차 순간주파수가 150 Hz를 넘지 않도록 최악 조건 ε = 90° 기준 전역 스케일 κ를 한 번만 정해 모든 에피소드에 같은 비율로 적용한다 (고각별 상대 차이 보존, ḟ_D^raw(90°) = −6449.3 Hz/s). κ는 궤도 정보 기반 보상과 수신기 주파수 추적 후 남는 Doppler 변화율 잔차의 크기를 정하는 모델링 선택이며, κ = 1(보상 없는 실제 변화율) 조건의 민감도 분석을 10.1절에 함께 보고한다. π ḟ_D t²는 선형 위상 램프(상수 회전)로 제거되지 않는 2차 위상이다.</w:t>
       </w:r>
     </w:p>
     <w:p>
@@ -5896,7 +5896,7 @@
         <w:pStyle w:val="Heading1"/>
       </w:pPr>
       <w:r>
-        <w:t>7. 제안 모델: BSC-UNet (Beam-ShortCut UNet)</w:t>
+        <w:t>7. 제안 모델: BSC-UNet-P (2차 위상 외삽 빔 지름길 UNet)</w:t>
       </w:r>
     </w:p>
     <w:p>
@@ -5905,7 +5905,7 @@
           <w:rFonts w:ascii="Malgun Gothic" w:hAnsi="Malgun Gothic" w:eastAsia="Malgun Gothic"/>
           <w:sz w:val="21"/>
         </w:rPr>
-        <w:t>전체 구조: 첫째 항은 빔 지름길(물리 구조: 추정 빔 방향 × 예측 빔 계수), 둘째 항은 UNet 보정(학습)이다.</w:t>
+        <w:t>전체 구조: 첫째 항은 빔 지름길(물리 구조: 추정 빔 방향 × 예측 빔 계수), 둘째 항은 UNet 보정(학습)이다. 빔 계수 예측은 학습형 선형 필터와 2차 위상 외삽의 합이다.</w:t>
       </w:r>
     </w:p>
     <w:p>
@@ -6036,6 +6036,26 @@
                   <m:t>𝐒</m:t>
                 </m:r>
               </m:e>
+              <m:e>
+                <m:r>
+                  <m:rPr>
+                    <m:sty m:val="p"/>
+                  </m:rPr>
+                  <m:t> </m:t>
+                </m:r>
+                <m:sSub>
+                  <m:e>
+                    <m:r>
+                      <m:t>𝐒</m:t>
+                    </m:r>
+                  </m:e>
+                  <m:sub>
+                    <m:r>
+                      <m:t>p</m:t>
+                    </m:r>
+                  </m:sub>
+                </m:sSub>
+              </m:e>
             </m:d>
           </m:e>
         </m:d>
@@ -6052,7 +6072,7 @@
           <w:color w:val="6E6E6E"/>
           <w:sz w:val="17"/>
         </w:rPr>
-        <w:t>\hat{\mathbf{h}}(i^\star)=\hat{s}(i^\star)\,\hat{\mathbf{a}}+U_\Theta\left(\left[\tilde{\mathbf{H}},\,\mathbf{S}\right]\right)</w:t>
+        <w:t>\hat{\mathbf{h}}(i^\star)=\hat{s}(i^\star)\,\hat{\mathbf{a}}+U_\Theta\left(\left[\tilde{\mathbf{H}},\,\mathbf{S},\,\mathbf{S}_{\mathrm{p}}\right]\right)</w:t>
       </w:r>
     </w:p>
     <w:p>
@@ -6727,7 +6747,7 @@
         <w:pStyle w:val="Heading2"/>
       </w:pPr>
       <w:r>
-        <w:t>7.2 빔 지름길 (학습형 선형 시간 예측)</w:t>
+        <w:t>7.2 빔 지름길: 학습형 선형 필터 + 2차 위상 외삽</w:t>
       </w:r>
     </w:p>
     <w:p>
@@ -6736,7 +6756,7 @@
           <w:rFonts w:ascii="Malgun Gothic" w:hAnsi="Malgun Gothic" w:eastAsia="Malgun Gothic"/>
           <w:sz w:val="21"/>
         </w:rPr>
-        <w:t>복소 T_p탭 필터 w_l은 0으로 초기화한다.</w:t>
+        <w:t>빔 계수 history s(τ)를 구한다.</w:t>
       </w:r>
     </w:p>
     <w:p>
@@ -6787,6 +6807,328 @@
           </m:rPr>
           <m:t>      </m:t>
         </m:r>
+        <m:r>
+          <m:t>τ=w,…,w+</m:t>
+        </m:r>
+        <m:sSub>
+          <m:e>
+            <m:r>
+              <m:t>T</m:t>
+            </m:r>
+          </m:e>
+          <m:sub>
+            <m:r>
+              <m:t>p</m:t>
+            </m:r>
+          </m:sub>
+        </m:sSub>
+        <m:r>
+          <m:t>−1</m:t>
+        </m:r>
+      </m:oMath>
+    </w:p>
+    <w:p>
+      <w:pPr>
+        <w:spacing w:after="160"/>
+        <w:jc w:val="left"/>
+      </w:pPr>
+      <w:r>
+        <w:rPr>
+          <w:rFonts w:ascii="Consolas" w:hAnsi="Consolas" w:eastAsia="Malgun Gothic"/>
+          <w:color w:val="6E6E6E"/>
+          <w:sz w:val="17"/>
+        </w:rPr>
+        <w:t>s(\tau)=\hat{\mathbf{a}}^{H}\tilde{\mathbf{h}}(\tau),\qquad \tau=w,\dots,w+T_p-1</w:t>
+      </w:r>
+    </w:p>
+    <w:p>
+      <w:r>
+        <w:rPr>
+          <w:rFonts w:ascii="Malgun Gothic" w:hAnsi="Malgun Gothic" w:eastAsia="Malgun Gothic"/>
+          <w:sz w:val="21"/>
+        </w:rPr>
+        <w:t>2차 위상 외삽 (학습 없음): 시간축 o = τ − (w+T_p−1) ∈ {−(T_p−1), …, 0}에서 언랩 위상을 2차식, 크기를 1차식으로 최소제곱 적합해 o = k로 외삽한다. Doppler 변화율 잔차가 만드는 에피소드별 2차 위상 π ḟ_D t²를 윈도우마다 직접 따라가기 위한 항이다 (고정 선형 필터는 에피소드마다 다른 ḟ_D의 2차 위상을 외삽할 수 없음).</w:t>
+      </w:r>
+    </w:p>
+    <w:p>
+      <w:pPr>
+        <w:jc w:val="center"/>
+      </w:pPr>
+      <m:oMath>
+        <m:r>
+          <m:rPr>
+            <m:sty m:val="p"/>
+          </m:rPr>
+          <m:t>\arg</m:t>
+        </m:r>
+        <m:r>
+          <m:t>s(o)≈</m:t>
+        </m:r>
+        <m:sSub>
+          <m:e>
+            <m:r>
+              <m:t>c</m:t>
+            </m:r>
+          </m:e>
+          <m:sub>
+            <m:r>
+              <m:t>2</m:t>
+            </m:r>
+          </m:sub>
+        </m:sSub>
+        <m:sSup>
+          <m:e>
+            <m:r>
+              <m:t>o</m:t>
+            </m:r>
+          </m:e>
+          <m:sup>
+            <m:r>
+              <m:t>2</m:t>
+            </m:r>
+          </m:sup>
+        </m:sSup>
+        <m:r>
+          <m:t>+</m:t>
+        </m:r>
+        <m:sSub>
+          <m:e>
+            <m:r>
+              <m:t>c</m:t>
+            </m:r>
+          </m:e>
+          <m:sub>
+            <m:r>
+              <m:t>1</m:t>
+            </m:r>
+          </m:sub>
+        </m:sSub>
+        <m:r>
+          <m:t>o+</m:t>
+        </m:r>
+        <m:sSub>
+          <m:e>
+            <m:r>
+              <m:t>c</m:t>
+            </m:r>
+          </m:e>
+          <m:sub>
+            <m:r>
+              <m:t>0</m:t>
+            </m:r>
+          </m:sub>
+        </m:sSub>
+        <m:r>
+          <m:t>,</m:t>
+        </m:r>
+        <m:r>
+          <m:rPr>
+            <m:sty m:val="p"/>
+          </m:rPr>
+          <m:t>      </m:t>
+        </m:r>
+        <m:r>
+          <m:t>|s(o)|≈</m:t>
+        </m:r>
+        <m:sSub>
+          <m:e>
+            <m:r>
+              <m:t>d</m:t>
+            </m:r>
+          </m:e>
+          <m:sub>
+            <m:r>
+              <m:t>1</m:t>
+            </m:r>
+          </m:sub>
+        </m:sSub>
+        <m:r>
+          <m:t>o+</m:t>
+        </m:r>
+        <m:sSub>
+          <m:e>
+            <m:r>
+              <m:t>d</m:t>
+            </m:r>
+          </m:e>
+          <m:sub>
+            <m:r>
+              <m:t>0</m:t>
+            </m:r>
+          </m:sub>
+        </m:sSub>
+        <m:r>
+          <m:t>,</m:t>
+        </m:r>
+        <m:r>
+          <m:rPr>
+            <m:sty m:val="p"/>
+          </m:rPr>
+          <m:t>      </m:t>
+        </m:r>
+        <m:sSub>
+          <m:e>
+            <m:r>
+              <m:t>s</m:t>
+            </m:r>
+          </m:e>
+          <m:sub>
+            <m:r>
+              <m:t>p</m:t>
+            </m:r>
+          </m:sub>
+        </m:sSub>
+        <m:r>
+          <m:t>(k)=max</m:t>
+        </m:r>
+        <m:d>
+          <m:dPr>
+            <m:sepChr m:val=""/>
+          </m:dPr>
+          <m:e>
+            <m:r>
+              <m:t>0</m:t>
+            </m:r>
+            <m:r>
+              <m:t>,</m:t>
+            </m:r>
+            <m:r>
+              <m:rPr>
+                <m:sty m:val="p"/>
+              </m:rPr>
+              <m:t> </m:t>
+            </m:r>
+            <m:sSub>
+              <m:e>
+                <m:r>
+                  <m:t>d</m:t>
+                </m:r>
+              </m:e>
+              <m:sub>
+                <m:r>
+                  <m:t>1</m:t>
+                </m:r>
+              </m:sub>
+            </m:sSub>
+            <m:r>
+              <m:t>k</m:t>
+            </m:r>
+            <m:r>
+              <m:t>+</m:t>
+            </m:r>
+            <m:sSub>
+              <m:e>
+                <m:r>
+                  <m:t>d</m:t>
+                </m:r>
+              </m:e>
+              <m:sub>
+                <m:r>
+                  <m:t>0</m:t>
+                </m:r>
+              </m:sub>
+            </m:sSub>
+          </m:e>
+        </m:d>
+        <m:sSup>
+          <m:e>
+            <m:r>
+              <m:t>e</m:t>
+            </m:r>
+          </m:e>
+          <m:sup>
+            <m:r>
+              <m:t>j(</m:t>
+            </m:r>
+            <m:sSub>
+              <m:e>
+                <m:r>
+                  <m:t>c</m:t>
+                </m:r>
+              </m:e>
+              <m:sub>
+                <m:r>
+                  <m:t>2</m:t>
+                </m:r>
+              </m:sub>
+            </m:sSub>
+            <m:sSup>
+              <m:e>
+                <m:r>
+                  <m:t>k</m:t>
+                </m:r>
+              </m:e>
+              <m:sup>
+                <m:r>
+                  <m:t>2</m:t>
+                </m:r>
+              </m:sup>
+            </m:sSup>
+            <m:r>
+              <m:t>+</m:t>
+            </m:r>
+            <m:sSub>
+              <m:e>
+                <m:r>
+                  <m:t>c</m:t>
+                </m:r>
+              </m:e>
+              <m:sub>
+                <m:r>
+                  <m:t>1</m:t>
+                </m:r>
+              </m:sub>
+            </m:sSub>
+            <m:r>
+              <m:t>k+</m:t>
+            </m:r>
+            <m:sSub>
+              <m:e>
+                <m:r>
+                  <m:t>c</m:t>
+                </m:r>
+              </m:e>
+              <m:sub>
+                <m:r>
+                  <m:t>0</m:t>
+                </m:r>
+              </m:sub>
+            </m:sSub>
+            <m:r>
+              <m:t>)</m:t>
+            </m:r>
+          </m:sup>
+        </m:sSup>
+      </m:oMath>
+    </w:p>
+    <w:p>
+      <w:pPr>
+        <w:spacing w:after="160"/>
+        <w:jc w:val="left"/>
+      </w:pPr>
+      <w:r>
+        <w:rPr>
+          <w:rFonts w:ascii="Consolas" w:hAnsi="Consolas" w:eastAsia="Malgun Gothic"/>
+          <w:color w:val="6E6E6E"/>
+          <w:sz w:val="17"/>
+        </w:rPr>
+        <w:t>\arg s(o)\approx c_2o^2+c_1o+c_0,\qquad |s(o)|\approx d_1o+d_0,\qquad s_{\mathrm{p}}(k)=\max\left(0,\,d_1k+d_0\right)e^{j(c_2k^2+c_1k+c_0)}</w:t>
+      </w:r>
+    </w:p>
+    <w:p>
+      <w:r>
+        <w:rPr>
+          <w:rFonts w:ascii="Malgun Gothic" w:hAnsi="Malgun Gothic" w:eastAsia="Malgun Gothic"/>
+          <w:sz w:val="21"/>
+        </w:rPr>
+        <w:t>빔 계수 예측: 학습형 복소 T_p탭 필터(0으로 초기화)와 복소 이득 c(1로 초기화)를 쓴 2차 외삽의 합. 학습 시작점은 매니폴드 빔 + 2차 외삽(ManifoldPoly2)과 같다.</w:t>
+      </w:r>
+    </w:p>
+    <w:p>
+      <w:pPr>
+        <w:jc w:val="center"/>
+      </w:pPr>
+      <m:oMath>
         <m:acc>
           <m:accPr>
             <m:chr m:val="̂"/>
@@ -6867,7 +7209,28 @@
           <m:t> </m:t>
         </m:r>
         <m:r>
-          <m:t>s(w+l),</m:t>
+          <m:t>s(w+l)+c</m:t>
+        </m:r>
+        <m:r>
+          <m:rPr>
+            <m:sty m:val="p"/>
+          </m:rPr>
+          <m:t> </m:t>
+        </m:r>
+        <m:sSub>
+          <m:e>
+            <m:r>
+              <m:t>s</m:t>
+            </m:r>
+          </m:e>
+          <m:sub>
+            <m:r>
+              <m:t>p</m:t>
+            </m:r>
+          </m:sub>
+        </m:sSub>
+        <m:r>
+          <m:t>(k),</m:t>
         </m:r>
         <m:r>
           <m:rPr>
@@ -6888,7 +7251,16 @@
           </m:sub>
         </m:sSub>
         <m:r>
-          <m:t>∈ℂ</m:t>
+          <m:t>,</m:t>
+        </m:r>
+        <m:r>
+          <m:rPr>
+            <m:sty m:val="p"/>
+          </m:rPr>
+          <m:t> </m:t>
+        </m:r>
+        <m:r>
+          <m:t>c∈ℂ</m:t>
         </m:r>
       </m:oMath>
     </w:p>
@@ -6903,7 +7275,7 @@
           <w:color w:val="6E6E6E"/>
           <w:sz w:val="17"/>
         </w:rPr>
-        <w:t>s(\tau)=\hat{\mathbf{a}}^{H}\tilde{\mathbf{h}}(\tau),\qquad \hat{s}(i^\star)=\sum_{l=0}^{T_p-1}w_l\,s(w+l),\qquad w_l\in\mathbb{C}</w:t>
+        <w:t>\hat{s}(i^\star)=\sum_{l=0}^{T_p-1}w_l\,s(w+l)+c\,s_{\mathrm{p}}(k),\qquad w_l,\,c\in\mathbb{C}</w:t>
       </w:r>
     </w:p>
     <w:p>
@@ -6922,7 +7294,7 @@
           <w:color w:val="285AA0"/>
           <w:sz w:val="18"/>
         </w:rPr>
-        <w:t>_beam_shortcut, 파라미터 w_re, w_im</w:t>
+        <w:t>csi_models.BeamShortcutPolyUNet, poly2_extrapolate, 파라미터 w_re, w_im, c_re, c_im (버퍼 poly_k = k)</w:t>
       </w:r>
     </w:p>
     <w:p>
@@ -6939,7 +7311,7 @@
           <w:rFonts w:ascii="Malgun Gothic" w:hAnsi="Malgun Gothic" w:eastAsia="Malgun Gothic"/>
           <w:sz w:val="21"/>
         </w:rPr>
-        <w:t>입력은 원래 history와 빔 투영(잡음 제거) history의 연결이다 (4T_p = 80 채널).</w:t>
+        <w:t>입력은 원래 history, 빔 투영(잡음 제거) history, 2차 외삽 빔 투영의 연결이다 (4T_p + 2 = 82 채널). 파라미터 수 7,044,396.</w:t>
       </w:r>
     </w:p>
     <w:p>
@@ -6978,6 +7350,61 @@
         <m:sSub>
           <m:e>
             <m:r>
+              <m:t>𝐒</m:t>
+            </m:r>
+          </m:e>
+          <m:sub>
+            <m:r>
+              <m:t>p</m:t>
+            </m:r>
+          </m:sub>
+        </m:sSub>
+        <m:r>
+          <m:t>=</m:t>
+        </m:r>
+        <m:sSub>
+          <m:e>
+            <m:r>
+              <m:t>s</m:t>
+            </m:r>
+          </m:e>
+          <m:sub>
+            <m:r>
+              <m:t>p</m:t>
+            </m:r>
+          </m:sub>
+        </m:sSub>
+        <m:r>
+          <m:t>(k)</m:t>
+        </m:r>
+        <m:r>
+          <m:rPr>
+            <m:sty m:val="p"/>
+          </m:rPr>
+          <m:t> </m:t>
+        </m:r>
+        <m:acc>
+          <m:accPr>
+            <m:chr m:val="̂"/>
+          </m:accPr>
+          <m:e>
+            <m:r>
+              <m:t>𝐚</m:t>
+            </m:r>
+          </m:e>
+        </m:acc>
+        <m:r>
+          <m:t>,</m:t>
+        </m:r>
+        <m:r>
+          <m:rPr>
+            <m:sty m:val="p"/>
+          </m:rPr>
+          <m:t>      </m:t>
+        </m:r>
+        <m:sSub>
+          <m:e>
+            <m:r>
               <m:t>U</m:t>
             </m:r>
           </m:e>
@@ -6998,7 +7425,7 @@
           </m:e>
           <m:sup>
             <m:r>
-              <m:t>4</m:t>
+              <m:t>(4</m:t>
             </m:r>
             <m:sSub>
               <m:e>
@@ -7013,7 +7440,7 @@
               </m:sub>
             </m:sSub>
             <m:r>
-              <m:t>×16×16</m:t>
+              <m:t>+2)×16×16</m:t>
             </m:r>
           </m:sup>
         </m:sSup>
@@ -7045,7 +7472,7 @@
           <w:color w:val="6E6E6E"/>
           <w:sz w:val="17"/>
         </w:rPr>
-        <w:t>\mathbf{S}(\tau)=s(\tau)\,\hat{\mathbf{a}},\qquad U_\Theta:\mathbb{R}^{4T_p\times16\times16}\rightarrow\mathbb{R}^{2\times16\times16}</w:t>
+        <w:t>\mathbf{S}(\tau)=s(\tau)\,\hat{\mathbf{a}},\qquad \mathbf{S}_{\mathrm{p}}=s_{\mathrm{p}}(k)\,\hat{\mathbf{a}},\qquad U_\Theta:\mathbb{R}^{(4T_p+2)\times16\times16}\rightarrow\mathbb{R}^{2\times16\times16}</w:t>
       </w:r>
     </w:p>
     <w:tbl>
@@ -7151,7 +7578,7 @@
                 <w:rFonts w:ascii="Malgun Gothic" w:hAnsi="Malgun Gothic" w:eastAsia="Malgun Gothic"/>
                 <w:sz w:val="19"/>
               </w:rPr>
-              <w:t>80×16² → 64×8²</w:t>
+              <w:t>82×16² → 64×8²</w:t>
             </w:r>
           </w:p>
         </w:tc>
@@ -7456,7 +7883,7 @@
           <w:color w:val="285AA0"/>
           <w:sz w:val="18"/>
         </w:rPr>
-        <w:t>csi_models.GeneratorUNet, BeamShortcutUNet.forward</w:t>
+        <w:t>csi_models.GeneratorUNet, BeamShortcutPolyUNet.forward</w:t>
       </w:r>
     </w:p>
     <w:p>
@@ -7473,7 +7900,7 @@
           <w:rFonts w:ascii="Malgun Gothic" w:hAnsi="Malgun Gothic" w:eastAsia="Malgun Gothic"/>
           <w:sz w:val="21"/>
         </w:rPr>
-        <w:t>빔 필터 w와 UNet Θ를 end-to-end로 함께 학습한다 (MSE, NMSE와 일치).</w:t>
+        <w:t>빔 필터 w, 외삽 이득 c, UNet Θ를 end-to-end로 함께 학습한다 (MSE, NMSE와 일치).</w:t>
       </w:r>
     </w:p>
     <w:p>
@@ -7482,7 +7909,7 @@
       </w:pPr>
       <m:oMath>
         <m:r>
-          <m:t>ℒ(Θ,𝐰)=</m:t>
+          <m:t>ℒ(Θ,𝐰,c)=</m:t>
         </m:r>
         <m:f>
           <m:fPr>
@@ -7609,7 +8036,229 @@
           <w:color w:val="6E6E6E"/>
           <w:sz w:val="17"/>
         </w:rPr>
-        <w:t>\mathcal{L}(\Theta,\mathbf{w})=\frac{1}{N}\sum_{\text{batch}}\left\|\hat{\mathbf{h}}(i^\star)-\bar{\mathbf{h}}(i^\star)\right\|^2</w:t>
+        <w:t>\mathcal{L}(\Theta,\mathbf{w},c)=\frac{1}{N}\sum_{\text{batch}}\left\|\hat{\mathbf{h}}(i^\star)-\bar{\mathbf{h}}(i^\star)\right\|^2</w:t>
+      </w:r>
+    </w:p>
+    <w:p>
+      <w:r>
+        <w:rPr>
+          <w:rFonts w:ascii="Malgun Gothic" w:hAnsi="Malgun Gothic" w:eastAsia="Malgun Gothic"/>
+          <w:sz w:val="21"/>
+        </w:rPr>
+        <w:t>학습률은 epoch e(= 1, 2, …)에서 다음과 같다: 80 epoch 동안 코사인으로 감소한 뒤 η_min 유지.</w:t>
+      </w:r>
+    </w:p>
+    <w:p>
+      <w:pPr>
+        <w:jc w:val="center"/>
+      </w:pPr>
+      <m:oMath>
+        <m:sSub>
+          <m:e>
+            <m:r>
+              <m:t>η</m:t>
+            </m:r>
+          </m:e>
+          <m:sub>
+            <m:r>
+              <m:t>e</m:t>
+            </m:r>
+          </m:sub>
+        </m:sSub>
+        <m:r>
+          <m:t>=</m:t>
+        </m:r>
+        <m:sSub>
+          <m:e>
+            <m:r>
+              <m:t>η</m:t>
+            </m:r>
+          </m:e>
+          <m:sub>
+            <m:r>
+              <m:t>min</m:t>
+            </m:r>
+          </m:sub>
+        </m:sSub>
+        <m:r>
+          <m:t>+</m:t>
+        </m:r>
+        <m:f>
+          <m:fPr>
+            <m:type m:val="bar"/>
+          </m:fPr>
+          <m:num>
+            <m:r>
+              <m:t>1</m:t>
+            </m:r>
+          </m:num>
+          <m:den>
+            <m:r>
+              <m:t>2</m:t>
+            </m:r>
+          </m:den>
+        </m:f>
+        <m:d>
+          <m:dPr>
+            <m:sepChr m:val="−"/>
+          </m:dPr>
+          <m:e>
+            <m:sSub>
+              <m:e>
+                <m:r>
+                  <m:t>η</m:t>
+                </m:r>
+              </m:e>
+              <m:sub>
+                <m:r>
+                  <m:t>0</m:t>
+                </m:r>
+              </m:sub>
+            </m:sSub>
+          </m:e>
+          <m:e>
+            <m:sSub>
+              <m:e>
+                <m:r>
+                  <m:t>η</m:t>
+                </m:r>
+              </m:e>
+              <m:sub>
+                <m:r>
+                  <m:t>min</m:t>
+                </m:r>
+              </m:sub>
+            </m:sSub>
+          </m:e>
+        </m:d>
+        <m:d>
+          <m:dPr>
+            <m:sepChr m:val="+"/>
+          </m:dPr>
+          <m:e>
+            <m:r>
+              <m:t>1</m:t>
+            </m:r>
+          </m:e>
+          <m:e>
+            <m:r>
+              <m:rPr>
+                <m:sty m:val="p"/>
+              </m:rPr>
+              <m:t>cos</m:t>
+            </m:r>
+            <m:f>
+              <m:fPr>
+                <m:type m:val="bar"/>
+              </m:fPr>
+              <m:num>
+                <m:r>
+                  <m:t>πmin(e−1,</m:t>
+                </m:r>
+                <m:r>
+                  <m:rPr>
+                    <m:sty m:val="p"/>
+                  </m:rPr>
+                  <m:t> </m:t>
+                </m:r>
+                <m:r>
+                  <m:t>80)</m:t>
+                </m:r>
+              </m:num>
+              <m:den>
+                <m:r>
+                  <m:t>80</m:t>
+                </m:r>
+              </m:den>
+            </m:f>
+          </m:e>
+        </m:d>
+        <m:r>
+          <m:t>,</m:t>
+        </m:r>
+        <m:r>
+          <m:rPr>
+            <m:sty m:val="p"/>
+          </m:rPr>
+          <m:t>      </m:t>
+        </m:r>
+        <m:sSub>
+          <m:e>
+            <m:r>
+              <m:t>η</m:t>
+            </m:r>
+          </m:e>
+          <m:sub>
+            <m:r>
+              <m:t>0</m:t>
+            </m:r>
+          </m:sub>
+        </m:sSub>
+        <m:r>
+          <m:t>=</m:t>
+        </m:r>
+        <m:sSup>
+          <m:e>
+            <m:r>
+              <m:t>10</m:t>
+            </m:r>
+          </m:e>
+          <m:sup>
+            <m:r>
+              <m:t>−4</m:t>
+            </m:r>
+          </m:sup>
+        </m:sSup>
+        <m:r>
+          <m:t>,</m:t>
+        </m:r>
+        <m:r>
+          <m:rPr>
+            <m:sty m:val="p"/>
+          </m:rPr>
+          <m:t>   </m:t>
+        </m:r>
+        <m:sSub>
+          <m:e>
+            <m:r>
+              <m:t>η</m:t>
+            </m:r>
+          </m:e>
+          <m:sub>
+            <m:r>
+              <m:t>min</m:t>
+            </m:r>
+          </m:sub>
+        </m:sSub>
+        <m:r>
+          <m:t>=</m:t>
+        </m:r>
+        <m:sSup>
+          <m:e>
+            <m:r>
+              <m:t>10</m:t>
+            </m:r>
+          </m:e>
+          <m:sup>
+            <m:r>
+              <m:t>−6</m:t>
+            </m:r>
+          </m:sup>
+        </m:sSup>
+      </m:oMath>
+    </w:p>
+    <w:p>
+      <w:pPr>
+        <w:spacing w:after="160"/>
+        <w:jc w:val="left"/>
+      </w:pPr>
+      <w:r>
+        <w:rPr>
+          <w:rFonts w:ascii="Consolas" w:hAnsi="Consolas" w:eastAsia="Malgun Gothic"/>
+          <w:color w:val="6E6E6E"/>
+          <w:sz w:val="17"/>
+        </w:rPr>
+        <w:t>\eta_e=\eta_{\min}+\frac{1}{2}\left(\eta_0-\eta_{\min}\right)\left(1+\cos\frac{\pi\min(e-1,\,80)}{80}\right),\qquad \eta_0=10^{-4},\quad \eta_{\min}=10^{-6}</w:t>
       </w:r>
     </w:p>
     <w:tbl>
@@ -7715,7 +8364,7 @@
                 <w:rFonts w:ascii="Malgun Gothic" w:hAnsi="Malgun Gothic" w:eastAsia="Malgun Gothic"/>
                 <w:sz w:val="19"/>
               </w:rPr>
-              <w:t>cosine, 80 epoch 동안 10⁻⁴ → 10⁻⁶</w:t>
+              <w:t>코사인 80 epoch (10⁻⁴ → 10⁻⁶) 후 10⁻⁶ 유지 (위 식, LambdaLR)</w:t>
             </w:r>
           </w:p>
         </w:tc>
@@ -7834,7 +8483,7 @@
           <w:color w:val="285AA0"/>
           <w:sz w:val="18"/>
         </w:rPr>
-        <w:t>train_beam.py --lr_sched cosine --cosine_epochs 80 --ema 0.999 --beta1 0.9 --grad_clip 1.0 --patience 20 --epochs 100</w:t>
+        <w:t>train_beam.py --poly_shortcut --lr_sched cosine --cosine_epochs 80 --ema 0.999 --beta1 0.9 --grad_clip 1.0 --patience 20 --epochs 100</w:t>
       </w:r>
     </w:p>
     <w:p>
@@ -9440,7 +10089,278 @@
           <w:rFonts w:ascii="Malgun Gothic" w:hAnsi="Malgun Gothic" w:eastAsia="Malgun Gothic"/>
           <w:sz w:val="21"/>
         </w:rPr>
-        <w:t>ManifoldLinReg: BeamLinReg에서 g ← â (배열 매니폴드 빔, manifold_beam). BSC-UNet에서 UNet을 뺀 구조이며 지름길 필터를 닫힌 식으로 적합한다. ManifoldPoly2 (ablation): Poly2_blind에서 g ← â. 매니폴드 빔 + 2차 위상 외삽 (학습 없음).</w:t>
+        <w:t>ManifoldLinReg: BeamLinReg에서 g ← â (배열 매니폴드 빔, manifold_beam). 선형 지름길만 쓰고 UNet이 없는 구조 (필터를 닫힌 식으로 적합). ManifoldPoly2 (ablation): Poly2_blind에서 g ← â. BSC-UNet-P에서 학습 부분(w, c, UNet)을 모두 뺀 2차 외삽 지름길 (학습 없음).</w:t>
+      </w:r>
+    </w:p>
+    <w:p>
+      <w:r>
+        <w:rPr>
+          <w:rFonts w:ascii="Malgun Gothic" w:hAnsi="Malgun Gothic" w:eastAsia="Malgun Gothic"/>
+          <w:sz w:val="21"/>
+        </w:rPr>
+        <w:t>BSC-UNet-I (ablation): BSC-UNet-P에서 2차 외삽 항을 뺀 구조. 빔 지름길이 학습형 선형 필터뿐이다 (UNet 입력 4T_p = 80 채널).</w:t>
+      </w:r>
+    </w:p>
+    <w:p>
+      <w:pPr>
+        <w:jc w:val="center"/>
+      </w:pPr>
+      <m:oMath>
+        <m:sSub>
+          <m:e>
+            <m:acc>
+              <m:accPr>
+                <m:chr m:val="̂"/>
+              </m:accPr>
+              <m:e>
+                <m:r>
+                  <m:t>s</m:t>
+                </m:r>
+              </m:e>
+            </m:acc>
+          </m:e>
+          <m:sub>
+            <m:r>
+              <m:t>I</m:t>
+            </m:r>
+          </m:sub>
+        </m:sSub>
+        <m:r>
+          <m:t>(</m:t>
+        </m:r>
+        <m:sSup>
+          <m:e>
+            <m:r>
+              <m:t>i</m:t>
+            </m:r>
+          </m:e>
+          <m:sup>
+            <m:r>
+              <m:t>⋆</m:t>
+            </m:r>
+          </m:sup>
+        </m:sSup>
+        <m:r>
+          <m:t>)=</m:t>
+        </m:r>
+        <m:nary>
+          <m:naryPr>
+            <m:chr m:val="∑"/>
+            <m:limLoc m:val="subSup"/>
+            <m:grow m:val="1"/>
+            <m:subHide m:val="off"/>
+            <m:supHide m:val="off"/>
+          </m:naryPr>
+          <m:sub>
+            <m:r>
+              <m:t>l=0</m:t>
+            </m:r>
+          </m:sub>
+          <m:sup>
+            <m:sSub>
+              <m:e>
+                <m:r>
+                  <m:t>T</m:t>
+                </m:r>
+              </m:e>
+              <m:sub>
+                <m:r>
+                  <m:t>p</m:t>
+                </m:r>
+              </m:sub>
+            </m:sSub>
+            <m:r>
+              <m:t>−1</m:t>
+            </m:r>
+          </m:sup>
+          <m:e>
+            <m:sSub>
+              <m:e>
+                <m:r>
+                  <m:t>w</m:t>
+                </m:r>
+              </m:e>
+              <m:sub>
+                <m:r>
+                  <m:t>l</m:t>
+                </m:r>
+              </m:sub>
+            </m:sSub>
+          </m:e>
+        </m:nary>
+        <m:r>
+          <m:rPr>
+            <m:sty m:val="p"/>
+          </m:rPr>
+          <m:t> </m:t>
+        </m:r>
+        <m:r>
+          <m:t>s(w+l),</m:t>
+        </m:r>
+        <m:r>
+          <m:rPr>
+            <m:sty m:val="p"/>
+          </m:rPr>
+          <m:t>      </m:t>
+        </m:r>
+        <m:sSub>
+          <m:e>
+            <m:acc>
+              <m:accPr>
+                <m:chr m:val="̂"/>
+              </m:accPr>
+              <m:e>
+                <m:r>
+                  <m:t>𝐡</m:t>
+                </m:r>
+              </m:e>
+            </m:acc>
+          </m:e>
+          <m:sub>
+            <m:r>
+              <m:t>I</m:t>
+            </m:r>
+          </m:sub>
+        </m:sSub>
+        <m:r>
+          <m:t>(</m:t>
+        </m:r>
+        <m:sSup>
+          <m:e>
+            <m:r>
+              <m:t>i</m:t>
+            </m:r>
+          </m:e>
+          <m:sup>
+            <m:r>
+              <m:t>⋆</m:t>
+            </m:r>
+          </m:sup>
+        </m:sSup>
+        <m:r>
+          <m:t>)=</m:t>
+        </m:r>
+        <m:sSub>
+          <m:e>
+            <m:acc>
+              <m:accPr>
+                <m:chr m:val="̂"/>
+              </m:accPr>
+              <m:e>
+                <m:r>
+                  <m:t>s</m:t>
+                </m:r>
+              </m:e>
+            </m:acc>
+          </m:e>
+          <m:sub>
+            <m:r>
+              <m:t>I</m:t>
+            </m:r>
+          </m:sub>
+        </m:sSub>
+        <m:r>
+          <m:t>(</m:t>
+        </m:r>
+        <m:sSup>
+          <m:e>
+            <m:r>
+              <m:t>i</m:t>
+            </m:r>
+          </m:e>
+          <m:sup>
+            <m:r>
+              <m:t>⋆</m:t>
+            </m:r>
+          </m:sup>
+        </m:sSup>
+        <m:r>
+          <m:t>)</m:t>
+        </m:r>
+        <m:r>
+          <m:rPr>
+            <m:sty m:val="p"/>
+          </m:rPr>
+          <m:t> </m:t>
+        </m:r>
+        <m:acc>
+          <m:accPr>
+            <m:chr m:val="̂"/>
+          </m:accPr>
+          <m:e>
+            <m:r>
+              <m:t>𝐚</m:t>
+            </m:r>
+          </m:e>
+        </m:acc>
+        <m:r>
+          <m:t>+</m:t>
+        </m:r>
+        <m:sSub>
+          <m:e>
+            <m:r>
+              <m:t>U</m:t>
+            </m:r>
+          </m:e>
+          <m:sub>
+            <m:r>
+              <m:t>Θ</m:t>
+            </m:r>
+          </m:sub>
+        </m:sSub>
+        <m:d>
+          <m:dPr>
+            <m:sepChr m:val=""/>
+          </m:dPr>
+          <m:e>
+            <m:d>
+              <m:dPr>
+                <m:begChr m:val="["/>
+                <m:sepChr m:val=","/>
+                <m:endChr m:val="]"/>
+              </m:dPr>
+              <m:e>
+                <m:limUpp>
+                  <m:e>
+                    <m:r>
+                      <m:t>𝐇</m:t>
+                    </m:r>
+                  </m:e>
+                  <m:lim>
+                    <m:r>
+                      <m:t>~</m:t>
+                    </m:r>
+                  </m:lim>
+                </m:limUpp>
+              </m:e>
+              <m:e>
+                <m:r>
+                  <m:rPr>
+                    <m:sty m:val="p"/>
+                  </m:rPr>
+                  <m:t> </m:t>
+                </m:r>
+                <m:r>
+                  <m:t>𝐒</m:t>
+                </m:r>
+              </m:e>
+            </m:d>
+          </m:e>
+        </m:d>
+      </m:oMath>
+    </w:p>
+    <w:p>
+      <w:pPr>
+        <w:spacing w:after="160"/>
+        <w:jc w:val="left"/>
+      </w:pPr>
+      <w:r>
+        <w:rPr>
+          <w:rFonts w:ascii="Consolas" w:hAnsi="Consolas" w:eastAsia="Malgun Gothic"/>
+          <w:color w:val="6E6E6E"/>
+          <w:sz w:val="17"/>
+        </w:rPr>
+        <w:t>\hat{s}_{\mathrm{I}}(i^\star)=\sum_{l=0}^{T_p-1}w_l\,s(w+l),\qquad \hat{\mathbf{h}}_{\mathrm{I}}(i^\star)=\hat{s}_{\mathrm{I}}(i^\star)\,\hat{\mathbf{a}}+U_\Theta\left(\left[\tilde{\mathbf{H}},\,\mathbf{S}\right]\right)</w:t>
       </w:r>
     </w:p>
     <w:p>
@@ -9727,7 +10647,7 @@
         <w:pStyle w:val="Heading1"/>
       </w:pPr>
       <w:r>
-        <w:t>10. 확장: 기하 일관 데이터(v10)와 빔 정렬 모델(BSC-UNet-AI)</w:t>
+        <w:t>10. 민감도 분석과 한계 시험</w:t>
       </w:r>
     </w:p>
     <w:p>
@@ -9735,7 +10655,7 @@
         <w:pStyle w:val="Heading2"/>
       </w:pPr>
       <w:r>
-        <w:t>10.1 구면 궤도 기하</w:t>
+        <w:t>10.1 Doppler 변화율 스케일 κ</w:t>
       </w:r>
     </w:p>
     <w:p>
@@ -9744,7 +10664,7 @@
           <w:rFonts w:ascii="Malgun Gothic" w:hAnsi="Malgun Gothic" w:eastAsia="Malgun Gothic"/>
           <w:sz w:val="21"/>
         </w:rPr>
-        <w:t>에피소드마다 고각 ε_e(같은 스윕·split)에 대해 단말 cross-track 중심각 ψ와 통과 방향 σ를 뽑고 (전용 난수열), 지구 중심 좌표에서 위성·단말 위치와 속도를 정한다.</w:t>
+        <w:t>κ = 1(보상 없는 실제 변화율) 데이터는 재생성 없이 저장된 채널에 빠진 2차 위상을 곱해 만든다 (모든 안테나·부반송파 공통 위상이라 정확). baseline은 κ = 1 train/val로 다시 적합하고, 모델은 κ = 1 데이터로 다시 학습한다.</w:t>
       </w:r>
     </w:p>
     <w:p>
@@ -9752,170 +10672,52 @@
         <w:jc w:val="center"/>
       </w:pPr>
       <m:oMath>
+        <m:sSubSup>
+          <m:e>
+            <m:r>
+              <m:t>𝐡</m:t>
+            </m:r>
+          </m:e>
+          <m:sub>
+            <m:r>
+              <m:t>q</m:t>
+            </m:r>
+          </m:sub>
+          <m:sup>
+            <m:d>
+              <m:dPr>
+                <m:sepChr m:val="="/>
+              </m:dPr>
+              <m:e>
+                <m:r>
+                  <m:t>κ</m:t>
+                </m:r>
+              </m:e>
+              <m:e>
+                <m:r>
+                  <m:t>1</m:t>
+                </m:r>
+              </m:e>
+            </m:d>
+          </m:sup>
+        </m:sSubSup>
         <m:r>
-          <m:t>ψ~𝒰[−γ,γ],</m:t>
-        </m:r>
-        <m:r>
-          <m:rPr>
-            <m:sty m:val="p"/>
-          </m:rPr>
-          <m:t>   </m:t>
-        </m:r>
-        <m:r>
-          <m:t>γ=</m:t>
+          <m:t>(i)=</m:t>
         </m:r>
         <m:sSub>
           <m:e>
             <m:r>
-              <m:t>θ</m:t>
+              <m:t>𝐡</m:t>
             </m:r>
           </m:e>
           <m:sub>
             <m:r>
-              <m:t>0</m:t>
+              <m:t>q</m:t>
             </m:r>
           </m:sub>
         </m:sSub>
         <m:r>
-          <m:t>(</m:t>
-        </m:r>
-        <m:sSub>
-          <m:e>
-            <m:r>
-              <m:t>ε</m:t>
-            </m:r>
-          </m:e>
-          <m:sub>
-            <m:r>
-              <m:t>e</m:t>
-            </m:r>
-          </m:sub>
-        </m:sSub>
-        <m:r>
-          <m:t>),</m:t>
-        </m:r>
-        <m:r>
-          <m:rPr>
-            <m:sty m:val="p"/>
-          </m:rPr>
-          <m:t>   </m:t>
-        </m:r>
-        <m:r>
-          <m:t>σ∈{±1},</m:t>
-        </m:r>
-        <m:r>
-          <m:rPr>
-            <m:sty m:val="p"/>
-          </m:rPr>
-          <m:t>      </m:t>
-        </m:r>
-        <m:r>
-          <m:t>θ=σ</m:t>
-        </m:r>
-        <m:r>
-          <m:rPr>
-            <m:sty m:val="p"/>
-          </m:rPr>
-          <m:t>arccos</m:t>
-        </m:r>
-        <m:f>
-          <m:fPr>
-            <m:type m:val="bar"/>
-          </m:fPr>
-          <m:num>
-            <m:r>
-              <m:rPr>
-                <m:sty m:val="p"/>
-              </m:rPr>
-              <m:t>cos</m:t>
-            </m:r>
-            <m:r>
-              <m:t>γ</m:t>
-            </m:r>
-          </m:num>
-          <m:den>
-            <m:r>
-              <m:rPr>
-                <m:sty m:val="p"/>
-              </m:rPr>
-              <m:t>cos</m:t>
-            </m:r>
-            <m:r>
-              <m:t>ψ</m:t>
-            </m:r>
-          </m:den>
-        </m:f>
-      </m:oMath>
-    </w:p>
-    <w:p>
-      <w:pPr>
-        <w:spacing w:after="160"/>
-        <w:jc w:val="left"/>
-      </w:pPr>
-      <w:r>
-        <w:rPr>
-          <w:rFonts w:ascii="Consolas" w:hAnsi="Consolas" w:eastAsia="Malgun Gothic"/>
-          <w:color w:val="6E6E6E"/>
-          <w:sz w:val="17"/>
-        </w:rPr>
-        <w:t>\psi\sim\mathcal{U}[-\gamma,\gamma],\quad \gamma=\theta_0(\varepsilon_e),\quad \sigma\in\{\pm1\},\qquad \theta=\sigma\arccos\frac{\cos\gamma}{\cos\psi}</w:t>
-      </w:r>
-    </w:p>
-    <w:p>
-      <w:pPr>
-        <w:jc w:val="center"/>
-      </w:pPr>
-      <m:oMath>
-        <m:sSub>
-          <m:e>
-            <m:r>
-              <m:t>𝐫</m:t>
-            </m:r>
-          </m:e>
-          <m:sub>
-            <m:r>
-              <m:rPr>
-                <m:sty m:val="p"/>
-              </m:rPr>
-              <m:t>sat</m:t>
-            </m:r>
-          </m:sub>
-        </m:sSub>
-        <m:r>
-          <m:t>=</m:t>
-        </m:r>
-        <m:sSub>
-          <m:e>
-            <m:r>
-              <m:t>R</m:t>
-            </m:r>
-          </m:e>
-          <m:sub>
-            <m:r>
-              <m:t>h</m:t>
-            </m:r>
-          </m:sub>
-        </m:sSub>
-        <m:r>
-          <m:t>[</m:t>
-        </m:r>
-        <m:r>
-          <m:rPr>
-            <m:sty m:val="p"/>
-          </m:rPr>
-          <m:t>sin</m:t>
-        </m:r>
-        <m:r>
-          <m:t>θ,</m:t>
-        </m:r>
-        <m:r>
-          <m:rPr>
-            <m:sty m:val="p"/>
-          </m:rPr>
-          <m:t> </m:t>
-        </m:r>
-        <m:r>
-          <m:t>0,</m:t>
+          <m:t>(i)</m:t>
         </m:r>
         <m:r>
           <m:rPr>
@@ -9927,640 +10729,84 @@
           <m:rPr>
             <m:sty m:val="p"/>
           </m:rPr>
-          <m:t>cos</m:t>
+          <m:t>exp</m:t>
         </m:r>
-        <m:r>
-          <m:t>θ</m:t>
-        </m:r>
-        <m:sSup>
+        <m:d>
+          <m:dPr>
+            <m:sepChr m:val=""/>
+          </m:dPr>
           <m:e>
             <m:r>
-              <m:t>]</m:t>
-            </m:r>
-          </m:e>
-          <m:sup>
-            <m:r>
-              <m:t>T</m:t>
-            </m:r>
-          </m:sup>
-        </m:sSup>
-        <m:r>
-          <m:t>,</m:t>
-        </m:r>
-        <m:r>
-          <m:rPr>
-            <m:sty m:val="p"/>
-          </m:rPr>
-          <m:t>      </m:t>
-        </m:r>
-        <m:sSub>
-          <m:e>
-            <m:r>
-              <m:t>𝐫</m:t>
-            </m:r>
-          </m:e>
-          <m:sub>
-            <m:r>
-              <m:rPr>
-                <m:sty m:val="p"/>
-              </m:rPr>
-              <m:t>UE</m:t>
-            </m:r>
-          </m:sub>
-        </m:sSub>
-        <m:r>
-          <m:t>=</m:t>
-        </m:r>
-        <m:sSub>
-          <m:e>
-            <m:r>
-              <m:t>R</m:t>
-            </m:r>
-          </m:e>
-          <m:sub>
-            <m:r>
-              <m:t>e</m:t>
-            </m:r>
-          </m:sub>
-        </m:sSub>
-        <m:r>
-          <m:t>[0,</m:t>
-        </m:r>
-        <m:r>
-          <m:rPr>
-            <m:sty m:val="p"/>
-          </m:rPr>
-          <m:t> </m:t>
-        </m:r>
-        <m:r>
-          <m:rPr>
-            <m:sty m:val="p"/>
-          </m:rPr>
-          <m:t>sin</m:t>
-        </m:r>
-        <m:r>
-          <m:t>ψ,</m:t>
-        </m:r>
-        <m:r>
-          <m:rPr>
-            <m:sty m:val="p"/>
-          </m:rPr>
-          <m:t> </m:t>
-        </m:r>
-        <m:r>
-          <m:rPr>
-            <m:sty m:val="p"/>
-          </m:rPr>
-          <m:t>cos</m:t>
-        </m:r>
-        <m:r>
-          <m:t>ψ</m:t>
-        </m:r>
-        <m:sSup>
-          <m:e>
-            <m:r>
-              <m:t>]</m:t>
-            </m:r>
-          </m:e>
-          <m:sup>
-            <m:r>
-              <m:t>T</m:t>
-            </m:r>
-          </m:sup>
-        </m:sSup>
-        <m:r>
-          <m:t>,</m:t>
-        </m:r>
-        <m:r>
-          <m:rPr>
-            <m:sty m:val="p"/>
-          </m:rPr>
-          <m:t>      </m:t>
-        </m:r>
-        <m:r>
-          <m:t>𝐯=</m:t>
-        </m:r>
-        <m:sSub>
-          <m:e>
-            <m:r>
-              <m:t>v</m:t>
-            </m:r>
-          </m:e>
-          <m:sub>
-            <m:r>
-              <m:rPr>
-                <m:sty m:val="p"/>
-              </m:rPr>
-              <m:t>sat</m:t>
-            </m:r>
-          </m:sub>
-        </m:sSub>
-        <m:r>
-          <m:t>[</m:t>
-        </m:r>
-        <m:r>
-          <m:rPr>
-            <m:sty m:val="p"/>
-          </m:rPr>
-          <m:t>cos</m:t>
-        </m:r>
-        <m:r>
-          <m:t>θ,</m:t>
-        </m:r>
-        <m:r>
-          <m:rPr>
-            <m:sty m:val="p"/>
-          </m:rPr>
-          <m:t> </m:t>
-        </m:r>
-        <m:r>
-          <m:t>0,</m:t>
-        </m:r>
-        <m:r>
-          <m:rPr>
-            <m:sty m:val="p"/>
-          </m:rPr>
-          <m:t> </m:t>
-        </m:r>
-        <m:r>
-          <m:t>−</m:t>
-        </m:r>
-        <m:r>
-          <m:rPr>
-            <m:sty m:val="p"/>
-          </m:rPr>
-          <m:t>sin</m:t>
-        </m:r>
-        <m:r>
-          <m:t>θ</m:t>
-        </m:r>
-        <m:sSup>
-          <m:e>
-            <m:r>
-              <m:t>]</m:t>
-            </m:r>
-          </m:e>
-          <m:sup>
-            <m:r>
-              <m:t>T</m:t>
-            </m:r>
-          </m:sup>
-        </m:sSup>
-      </m:oMath>
-    </w:p>
-    <w:p>
-      <w:pPr>
-        <w:spacing w:after="160"/>
-        <w:jc w:val="left"/>
-      </w:pPr>
-      <w:r>
-        <w:rPr>
-          <w:rFonts w:ascii="Consolas" w:hAnsi="Consolas" w:eastAsia="Malgun Gothic"/>
-          <w:color w:val="6E6E6E"/>
-          <w:sz w:val="17"/>
-        </w:rPr>
-        <w:t>\mathbf{r}_{\mathrm{sat}}=R_h[\sin\theta,\,0,\,\cos\theta]^{T},\qquad \mathbf{r}_{\mathrm{UE}}=R_e[0,\,\sin\psi,\,\cos\psi]^{T},\qquad \mathbf{v}=v_{\mathrm{sat}}[\cos\theta,\,0,\,-\sin\theta]^{T}</w:t>
-      </w:r>
-    </w:p>
-    <w:p>
-      <w:r>
-        <w:rPr>
-          <w:rFonts w:ascii="Malgun Gothic" w:hAnsi="Malgun Gothic" w:eastAsia="Malgun Gothic"/>
-          <w:sz w:val="21"/>
-        </w:rPr>
-        <w:t>l = r_sat − r_UE, 위성 본체 축 x_b = v/v_sat, z_b = −r_sat/R_h (nadir), y_b = z_b × x_b, u = −l/‖l‖. 생성기는 ḟ_D를 1 ms 중앙 차분으로 계산하며 아래 닫힌 식과 상대오차 10⁻⁹ 미만으로 일치한다.</w:t>
-      </w:r>
-    </w:p>
-    <w:p>
-      <w:pPr>
-        <w:jc w:val="center"/>
-      </w:pPr>
-      <m:oMath>
-        <m:sSub>
-          <m:e>
-            <m:r>
-              <m:t>f</m:t>
-            </m:r>
-          </m:e>
-          <m:sub>
-            <m:r>
-              <m:t>D,</m:t>
-            </m:r>
-            <m:r>
-              <m:rPr>
-                <m:sty m:val="p"/>
-              </m:rPr>
-              <m:t>geo</m:t>
-            </m:r>
-          </m:sub>
-        </m:sSub>
-        <m:r>
-          <m:t>=−</m:t>
-        </m:r>
-        <m:f>
-          <m:fPr>
-            <m:type m:val="bar"/>
-          </m:fPr>
-          <m:num>
+              <m:t>j</m:t>
+            </m:r>
+            <m:r>
+              <m:t>π</m:t>
+            </m:r>
             <m:sSub>
               <m:e>
+                <m:limUpp>
+                  <m:e>
+                    <m:r>
+                      <m:t>f</m:t>
+                    </m:r>
+                  </m:e>
+                  <m:lim>
+                    <m:r>
+                      <m:t>˙</m:t>
+                    </m:r>
+                  </m:lim>
+                </m:limUpp>
+              </m:e>
+              <m:sub>
                 <m:r>
-                  <m:t>f</m:t>
+                  <m:t>D</m:t>
+                </m:r>
+              </m:sub>
+            </m:sSub>
+            <m:d>
+              <m:dPr>
+                <m:sepChr m:val="−"/>
+              </m:dPr>
+              <m:e>
+                <m:f>
+                  <m:fPr>
+                    <m:type m:val="bar"/>
+                  </m:fPr>
+                  <m:num>
+                    <m:r>
+                      <m:t>1</m:t>
+                    </m:r>
+                  </m:num>
+                  <m:den>
+                    <m:r>
+                      <m:t>κ</m:t>
+                    </m:r>
+                  </m:den>
+                </m:f>
+              </m:e>
+              <m:e>
+                <m:r>
+                  <m:t>1</m:t>
+                </m:r>
+              </m:e>
+            </m:d>
+            <m:sSubSup>
+              <m:e>
+                <m:r>
+                  <m:t>t</m:t>
                 </m:r>
               </m:e>
               <m:sub>
                 <m:r>
-                  <m:t>c</m:t>
+                  <m:t>i</m:t>
                 </m:r>
               </m:sub>
-            </m:sSub>
-          </m:num>
-          <m:den>
-            <m:r>
-              <m:t>c</m:t>
-            </m:r>
-          </m:den>
-        </m:f>
-        <m:r>
-          <m:rPr>
-            <m:sty m:val="p"/>
-          </m:rPr>
-          <m:t> </m:t>
-        </m:r>
-        <m:f>
-          <m:fPr>
-            <m:type m:val="bar"/>
-          </m:fPr>
-          <m:num>
-            <m:sSup>
-              <m:e>
-                <m:r>
-                  <m:t>𝐯</m:t>
-                </m:r>
-              </m:e>
-              <m:sup>
-                <m:r>
-                  <m:t>T</m:t>
-                </m:r>
-              </m:sup>
-            </m:sSup>
-            <m:r>
-              <m:t>𝐥</m:t>
-            </m:r>
-          </m:num>
-          <m:den>
-            <m:d>
-              <m:dPr>
-                <m:begChr m:val="‖"/>
-                <m:sepChr m:val=""/>
-                <m:endChr m:val="‖"/>
-              </m:dPr>
-              <m:e>
-                <m:r>
-                  <m:t>𝐥</m:t>
-                </m:r>
-              </m:e>
-            </m:d>
-          </m:den>
-        </m:f>
-        <m:r>
-          <m:t>,</m:t>
-        </m:r>
-        <m:r>
-          <m:rPr>
-            <m:sty m:val="p"/>
-          </m:rPr>
-          <m:t>      </m:t>
-        </m:r>
-        <m:sSub>
-          <m:e>
-            <m:limUpp>
-              <m:e>
-                <m:r>
-                  <m:t>f</m:t>
-                </m:r>
-              </m:e>
-              <m:lim>
-                <m:r>
-                  <m:t>˙</m:t>
-                </m:r>
-              </m:lim>
-            </m:limUpp>
-          </m:e>
-          <m:sub>
-            <m:r>
-              <m:t>D,</m:t>
-            </m:r>
-            <m:r>
-              <m:rPr>
-                <m:sty m:val="p"/>
-              </m:rPr>
-              <m:t>geo</m:t>
-            </m:r>
-          </m:sub>
-        </m:sSub>
-        <m:r>
-          <m:t>=−</m:t>
-        </m:r>
-        <m:f>
-          <m:fPr>
-            <m:type m:val="bar"/>
-          </m:fPr>
-          <m:num>
-            <m:sSub>
-              <m:e>
-                <m:r>
-                  <m:t>f</m:t>
-                </m:r>
-              </m:e>
-              <m:sub>
-                <m:r>
-                  <m:t>c</m:t>
-                </m:r>
-              </m:sub>
-            </m:sSub>
-          </m:num>
-          <m:den>
-            <m:r>
-              <m:t>c</m:t>
-            </m:r>
-          </m:den>
-        </m:f>
-        <m:r>
-          <m:rPr>
-            <m:sty m:val="p"/>
-          </m:rPr>
-          <m:t> </m:t>
-        </m:r>
-        <m:f>
-          <m:fPr>
-            <m:type m:val="bar"/>
-          </m:fPr>
-          <m:num>
-            <m:r>
-              <m:t>‖𝐯</m:t>
-            </m:r>
-            <m:sSup>
-              <m:e>
-                <m:r>
-                  <m:t>‖</m:t>
-                </m:r>
-              </m:e>
               <m:sup>
                 <m:r>
                   <m:t>2</m:t>
                 </m:r>
               </m:sup>
-            </m:sSup>
-            <m:r>
-              <m:t>+</m:t>
-            </m:r>
-            <m:sSup>
-              <m:e>
-                <m:r>
-                  <m:t>𝐥</m:t>
-                </m:r>
-              </m:e>
-              <m:sup>
-                <m:r>
-                  <m:t>T</m:t>
-                </m:r>
-              </m:sup>
-            </m:sSup>
-            <m:sSub>
-              <m:e>
-                <m:r>
-                  <m:t>𝐚</m:t>
-                </m:r>
-              </m:e>
-              <m:sub>
-                <m:r>
-                  <m:t>c</m:t>
-                </m:r>
-              </m:sub>
-            </m:sSub>
-            <m:r>
-              <m:t>−</m:t>
-            </m:r>
-            <m:sSup>
-              <m:e>
-                <m:d>
-                  <m:dPr>
-                    <m:sepChr m:val=""/>
-                  </m:dPr>
-                  <m:e>
-                    <m:sSup>
-                      <m:e>
-                        <m:r>
-                          <m:t>𝐯</m:t>
-                        </m:r>
-                      </m:e>
-                      <m:sup>
-                        <m:r>
-                          <m:t>T</m:t>
-                        </m:r>
-                      </m:sup>
-                    </m:sSup>
-                    <m:r>
-                      <m:t>𝐥</m:t>
-                    </m:r>
-                    <m:r>
-                      <m:t>/</m:t>
-                    </m:r>
-                    <m:r>
-                      <m:t>‖</m:t>
-                    </m:r>
-                    <m:r>
-                      <m:t>𝐥</m:t>
-                    </m:r>
-                    <m:r>
-                      <m:t>‖</m:t>
-                    </m:r>
-                  </m:e>
-                </m:d>
-              </m:e>
-              <m:sup>
-                <m:r>
-                  <m:t>2</m:t>
-                </m:r>
-              </m:sup>
-            </m:sSup>
-          </m:num>
-          <m:den>
-            <m:d>
-              <m:dPr>
-                <m:begChr m:val="‖"/>
-                <m:sepChr m:val=""/>
-                <m:endChr m:val="‖"/>
-              </m:dPr>
-              <m:e>
-                <m:r>
-                  <m:t>𝐥</m:t>
-                </m:r>
-              </m:e>
-            </m:d>
-          </m:den>
-        </m:f>
-        <m:r>
-          <m:t>,</m:t>
-        </m:r>
-        <m:r>
-          <m:rPr>
-            <m:sty m:val="p"/>
-          </m:rPr>
-          <m:t>      </m:t>
-        </m:r>
-        <m:sSub>
-          <m:e>
-            <m:r>
-              <m:t>𝐚</m:t>
-            </m:r>
-          </m:e>
-          <m:sub>
-            <m:r>
-              <m:t>c</m:t>
-            </m:r>
-          </m:sub>
-        </m:sSub>
-        <m:r>
-          <m:t>=−</m:t>
-        </m:r>
-        <m:sSup>
-          <m:e>
-            <m:r>
-              <m:t>ω</m:t>
-            </m:r>
-          </m:e>
-          <m:sup>
-            <m:r>
-              <m:t>2</m:t>
-            </m:r>
-          </m:sup>
-        </m:sSup>
-        <m:sSub>
-          <m:e>
-            <m:r>
-              <m:t>𝐫</m:t>
-            </m:r>
-          </m:e>
-          <m:sub>
-            <m:r>
-              <m:rPr>
-                <m:sty m:val="p"/>
-              </m:rPr>
-              <m:t>sat</m:t>
-            </m:r>
-          </m:sub>
-        </m:sSub>
-      </m:oMath>
-    </w:p>
-    <w:p>
-      <w:pPr>
-        <w:spacing w:after="160"/>
-        <w:jc w:val="left"/>
-      </w:pPr>
-      <w:r>
-        <w:rPr>
-          <w:rFonts w:ascii="Consolas" w:hAnsi="Consolas" w:eastAsia="Malgun Gothic"/>
-          <w:color w:val="6E6E6E"/>
-          <w:sz w:val="17"/>
-        </w:rPr>
-        <w:t>f_{D,\mathrm{geo}}=-\frac{f_c}{c}\,\frac{\mathbf{v}^{T}\mathbf{l}}{\|\mathbf{l}\|},\qquad \dot{f}_{D,\mathrm{geo}}=-\frac{f_c}{c}\,\frac{\|\mathbf{v}\|^2+\mathbf{l}^{T}\mathbf{a}_c-\left(\mathbf{v}^{T}\mathbf{l}/\|\mathbf{l}\|\right)^2}{\|\mathbf{l}\|},\qquad \mathbf{a}_c=-\omega^2\mathbf{r}_{\mathrm{sat}}</w:t>
-      </w:r>
-    </w:p>
-    <w:p>
-      <w:pPr>
-        <w:jc w:val="center"/>
-      </w:pPr>
-      <m:oMath>
-        <m:sSub>
-          <m:e>
-            <m:r>
-              <m:t>ϕ</m:t>
-            </m:r>
-          </m:e>
-          <m:sub>
-            <m:r>
-              <m:rPr>
-                <m:sty m:val="p"/>
-              </m:rPr>
-              <m:t>sat</m:t>
-            </m:r>
-          </m:sub>
-        </m:sSub>
-        <m:r>
-          <m:t>=</m:t>
-        </m:r>
-        <m:r>
-          <m:rPr>
-            <m:sty m:val="p"/>
-          </m:rPr>
-          <m:t>atan</m:t>
-        </m:r>
-        <m:r>
-          <m:t>2</m:t>
-        </m:r>
-        <m:d>
-          <m:dPr>
-            <m:sepChr m:val=","/>
-          </m:dPr>
-          <m:e>
-            <m:sSup>
-              <m:e>
-                <m:r>
-                  <m:t>𝐮</m:t>
-                </m:r>
-              </m:e>
-              <m:sup>
-                <m:r>
-                  <m:t>T</m:t>
-                </m:r>
-              </m:sup>
-            </m:sSup>
-            <m:sSub>
-              <m:e>
-                <m:r>
-                  <m:t>𝐲</m:t>
-                </m:r>
-              </m:e>
-              <m:sub>
-                <m:r>
-                  <m:t>b</m:t>
-                </m:r>
-              </m:sub>
-            </m:sSub>
-          </m:e>
-          <m:e>
-            <m:r>
-              <m:rPr>
-                <m:sty m:val="p"/>
-              </m:rPr>
-              <m:t> </m:t>
-            </m:r>
-            <m:sSup>
-              <m:e>
-                <m:r>
-                  <m:t>𝐮</m:t>
-                </m:r>
-              </m:e>
-              <m:sup>
-                <m:r>
-                  <m:t>T</m:t>
-                </m:r>
-              </m:sup>
-            </m:sSup>
-            <m:sSub>
-              <m:e>
-                <m:r>
-                  <m:t>𝐱</m:t>
-                </m:r>
-              </m:e>
-              <m:sub>
-                <m:r>
-                  <m:t>b</m:t>
-                </m:r>
-              </m:sub>
-            </m:sSub>
+            </m:sSubSup>
           </m:e>
         </m:d>
         <m:r>
@@ -10573,104 +10819,7 @@
           <m:t>      </m:t>
         </m:r>
         <m:r>
-          <m:t>η=</m:t>
-        </m:r>
-        <m:r>
-          <m:rPr>
-            <m:sty m:val="p"/>
-          </m:rPr>
-          <m:t>arccos</m:t>
-        </m:r>
-        <m:d>
-          <m:dPr>
-            <m:sepChr m:val=""/>
-          </m:dPr>
-          <m:e>
-            <m:sSup>
-              <m:e>
-                <m:r>
-                  <m:t>𝐮</m:t>
-                </m:r>
-              </m:e>
-              <m:sup>
-                <m:r>
-                  <m:t>T</m:t>
-                </m:r>
-              </m:sup>
-            </m:sSup>
-            <m:sSub>
-              <m:e>
-                <m:r>
-                  <m:t>𝐳</m:t>
-                </m:r>
-              </m:e>
-              <m:sub>
-                <m:r>
-                  <m:t>b</m:t>
-                </m:r>
-              </m:sub>
-            </m:sSub>
-          </m:e>
-        </m:d>
-        <m:r>
-          <m:t>,</m:t>
-        </m:r>
-        <m:r>
-          <m:rPr>
-            <m:sty m:val="p"/>
-          </m:rPr>
-          <m:t>      </m:t>
-        </m:r>
-        <m:r>
-          <m:rPr>
-            <m:sty m:val="p"/>
-          </m:rPr>
-          <m:t>sin</m:t>
-        </m:r>
-        <m:r>
-          <m:t>η=</m:t>
-        </m:r>
-        <m:f>
-          <m:fPr>
-            <m:type m:val="bar"/>
-          </m:fPr>
-          <m:num>
-            <m:sSub>
-              <m:e>
-                <m:r>
-                  <m:t>R</m:t>
-                </m:r>
-              </m:e>
-              <m:sub>
-                <m:r>
-                  <m:t>e</m:t>
-                </m:r>
-              </m:sub>
-            </m:sSub>
-          </m:num>
-          <m:den>
-            <m:sSub>
-              <m:e>
-                <m:r>
-                  <m:t>R</m:t>
-                </m:r>
-              </m:e>
-              <m:sub>
-                <m:r>
-                  <m:t>h</m:t>
-                </m:r>
-              </m:sub>
-            </m:sSub>
-          </m:den>
-        </m:f>
-        <m:r>
-          <m:rPr>
-            <m:sty m:val="p"/>
-          </m:rPr>
-          <m:t>cos</m:t>
-        </m:r>
-        <m:r>
-          <m:t>ε</m:t>
+          <m:t>κ=0.1551</m:t>
         </m:r>
       </m:oMath>
     </w:p>
@@ -10685,221 +10834,7 @@
           <w:color w:val="6E6E6E"/>
           <w:sz w:val="17"/>
         </w:rPr>
-        <w:t>\phi_{\mathrm{sat}}=\mathrm{atan2}\left(\mathbf{u}^{T}\mathbf{y}_b,\ \mathbf{u}^{T}\mathbf{x}_b\right),\qquad \eta=\arccos\left(\mathbf{u}^{T}\mathbf{z}_b\right),\qquad \sin\eta=\frac{R_e}{R_h}\cos\varepsilon</w:t>
-      </w:r>
-    </w:p>
-    <w:p>
-      <w:r>
-        <w:rPr>
-          <w:rFonts w:ascii="Malgun Gothic" w:hAnsi="Malgun Gothic" w:eastAsia="Malgun Gothic"/>
-          <w:sz w:val="21"/>
-        </w:rPr>
-        <w:t>nrCDLChannel에는 MaximumDopplerShift(2) = |f_D,geo|/cos ε (적용값 = |f_D,geo|), Doppler 변화율 잔차에는 κ·ḟ_D,geo를 쓴다. nadir 지향 배열을 단말 지점 좌표계에서 표현하는 회전(TR 38.901 LCS–GCS 변환, bearing–downtilt–slant)은 다음과 같다. 이때 LOS 위상 기울기의 크기는 π sin η, 방향은 180° − φ_sat이다 (생성 데이터로 확인). TR 38.811 통계 파라미터(K, DS, SF)는 고각만의 함수로 그대로 쓰고, 방위각은 배열 공간 응답에만 들어간다.</w:t>
-      </w:r>
-    </w:p>
-    <w:p>
-      <w:pPr>
-        <w:jc w:val="center"/>
-      </w:pPr>
-      <m:oMath>
-        <m:r>
-          <m:rPr>
-            <m:sty m:val="p"/>
-          </m:rPr>
-          <m:t>Orientation</m:t>
-        </m:r>
-        <m:r>
-          <m:t>=</m:t>
-        </m:r>
-        <m:d>
-          <m:dPr>
-            <m:begChr m:val="["/>
-            <m:sepChr m:val="−"/>
-            <m:endChr m:val="]"/>
-          </m:dPr>
-          <m:e>
-            <m:r>
-              <m:rPr>
-                <m:sty m:val="p"/>
-              </m:rPr>
-              <m:t> </m:t>
-            </m:r>
-            <m:r>
-              <m:t>0</m:t>
-            </m:r>
-            <m:r>
-              <m:t>;</m:t>
-            </m:r>
-            <m:r>
-              <m:rPr>
-                <m:sty m:val="p"/>
-              </m:rPr>
-              <m:t> </m:t>
-            </m:r>
-            <m:sSup>
-              <m:e>
-                <m:r>
-                  <m:t>90</m:t>
-                </m:r>
-              </m:e>
-              <m:sup>
-                <m:r>
-                  <m:t>∘</m:t>
-                </m:r>
-              </m:sup>
-            </m:sSup>
-          </m:e>
-          <m:e>
-            <m:sSub>
-              <m:e>
-                <m:r>
-                  <m:t>γ</m:t>
-                </m:r>
-              </m:e>
-              <m:sub>
-                <m:r>
-                  <m:t>c</m:t>
-                </m:r>
-              </m:sub>
-            </m:sSub>
-            <m:r>
-              <m:t>;</m:t>
-            </m:r>
-            <m:r>
-              <m:rPr>
-                <m:sty m:val="p"/>
-              </m:rPr>
-              <m:t> </m:t>
-            </m:r>
-            <m:sSub>
-              <m:e>
-                <m:r>
-                  <m:t>ϕ</m:t>
-                </m:r>
-              </m:e>
-              <m:sub>
-                <m:r>
-                  <m:rPr>
-                    <m:sty m:val="p"/>
-                  </m:rPr>
-                  <m:t>sat</m:t>
-                </m:r>
-              </m:sub>
-            </m:sSub>
-            <m:r>
-              <m:rPr>
-                <m:sty m:val="p"/>
-              </m:rPr>
-              <m:t> </m:t>
-            </m:r>
-          </m:e>
-        </m:d>
-        <m:r>
-          <m:t>,</m:t>
-        </m:r>
-        <m:r>
-          <m:rPr>
-            <m:sty m:val="p"/>
-          </m:rPr>
-          <m:t>      </m:t>
-        </m:r>
-        <m:sSub>
-          <m:e>
-            <m:r>
-              <m:t>γ</m:t>
-            </m:r>
-          </m:e>
-          <m:sub>
-            <m:r>
-              <m:t>c</m:t>
-            </m:r>
-          </m:sub>
-        </m:sSub>
-        <m:r>
-          <m:t>=</m:t>
-        </m:r>
-        <m:sSup>
-          <m:e>
-            <m:r>
-              <m:t>90</m:t>
-            </m:r>
-          </m:e>
-          <m:sup>
-            <m:r>
-              <m:t>∘</m:t>
-            </m:r>
-          </m:sup>
-        </m:sSup>
-        <m:r>
-          <m:t>−ε−η,</m:t>
-        </m:r>
-        <m:r>
-          <m:rPr>
-            <m:sty m:val="p"/>
-          </m:rPr>
-          <m:t>      </m:t>
-        </m:r>
-        <m:rad>
-          <m:radPr>
-            <m:degHide m:val="on"/>
-          </m:radPr>
-          <m:deg/>
-          <m:e>
-            <m:sSup>
-              <m:e>
-                <m:r>
-                  <m:t>α</m:t>
-                </m:r>
-              </m:e>
-              <m:sup>
-                <m:r>
-                  <m:t>2</m:t>
-                </m:r>
-              </m:sup>
-            </m:sSup>
-            <m:r>
-              <m:t>+</m:t>
-            </m:r>
-            <m:sSup>
-              <m:e>
-                <m:r>
-                  <m:t>β</m:t>
-                </m:r>
-              </m:e>
-              <m:sup>
-                <m:r>
-                  <m:t>2</m:t>
-                </m:r>
-              </m:sup>
-            </m:sSup>
-          </m:e>
-        </m:rad>
-        <m:r>
-          <m:t>=π</m:t>
-        </m:r>
-        <m:r>
-          <m:rPr>
-            <m:sty m:val="p"/>
-          </m:rPr>
-          <m:t>sin</m:t>
-        </m:r>
-        <m:r>
-          <m:t>η</m:t>
-        </m:r>
-      </m:oMath>
-    </w:p>
-    <w:p>
-      <w:pPr>
-        <w:spacing w:after="160"/>
-        <w:jc w:val="left"/>
-      </w:pPr>
-      <w:r>
-        <w:rPr>
-          <w:rFonts w:ascii="Consolas" w:hAnsi="Consolas" w:eastAsia="Malgun Gothic"/>
-          <w:color w:val="6E6E6E"/>
-          <w:sz w:val="17"/>
-        </w:rPr>
-        <w:t>\mathrm{Orientation}=\left[\,0;\ 90^\circ-\gamma_c;\ \phi_{\mathrm{sat}}\,\right],\qquad \gamma_c=90^\circ-\varepsilon-\eta,\qquad \sqrt{\alpha^2+\beta^2}=\pi\sin\eta</w:t>
+        <w:t>\mathbf{h}_q^{(\kappa=1)}(i)=\mathbf{h}_q(i)\,\exp\left(j\pi\dot{f}_D\left(\frac{1}{\kappa}-1\right)t_i^2\right),\qquad \kappa=0.1551</w:t>
       </w:r>
     </w:p>
     <w:p>
@@ -10918,7 +10853,7 @@
           <w:color w:val="285AA0"/>
           <w:sz w:val="18"/>
         </w:rPr>
-        <w:t>generate_ntn_csi_v10_fdd_dl.m: passGeometry, passState; 검증 check_doppler_rate_v10.py, validate_v10.py</w:t>
+        <w:t>data.rescale_doppler_rate, train_beam.py / evaluate.py --doppler_rate_kappa 1</w:t>
       </w:r>
     </w:p>
     <w:p>
@@ -10926,7 +10861,7 @@
         <w:pStyle w:val="Heading2"/>
       </w:pPr>
       <w:r>
-        <w:t>10.2 빔 정렬 모델 (BSC-UNet-AI)</w:t>
+        <w:t>10.2 Shadow fading 불변성</w:t>
       </w:r>
     </w:p>
     <w:p>
@@ -10935,7 +10870,7 @@
           <w:rFonts w:ascii="Malgun Gothic" w:hAnsi="Malgun Gothic" w:eastAsia="Malgun Gothic"/>
           <w:sz w:val="21"/>
         </w:rPr>
-        <w:t>빔 지름길은 7절과 같고, UNet은 추정 방향을 제거한 정렬 좌표에서 잔차를 예측한 뒤 방향을 되돌린다 (replicate 패딩). 방향이 달라도 UNet이 보는 입력이 같아지므로 방위각에 대한 일반화가 구조적으로 확보된다.</w:t>
+        <w:t>에피소드 상수 이득 g_e(TR 38.811대로 평균 0 로그정규, 양방향)를 관측 채널과 누적 최댓값에 함께 곱해도 인과적 정규화 후 모델 입력·정답이 같다 (검증: 최대 상대 차이 3×10⁻⁷, float32 반올림 수준). 따라서 구현의 max(0, ·) 절단은 예측 결과에 영향이 없다.</w:t>
       </w:r>
     </w:p>
     <w:p>
@@ -10943,324 +10878,120 @@
         <w:jc w:val="center"/>
       </w:pPr>
       <m:oMath>
-        <m:r>
-          <m:t>𝐮=16</m:t>
-        </m:r>
-        <m:r>
-          <m:rPr>
-            <m:sty m:val="p"/>
-          </m:rPr>
-          <m:t> </m:t>
-        </m:r>
-        <m:acc>
-          <m:accPr>
-            <m:chr m:val="̂"/>
-          </m:accPr>
-          <m:e>
-            <m:r>
-              <m:t>𝐚</m:t>
-            </m:r>
-          </m:e>
-        </m:acc>
-        <m:r>
-          <m:t>,</m:t>
-        </m:r>
-        <m:r>
-          <m:rPr>
-            <m:sty m:val="p"/>
-          </m:rPr>
-          <m:t>      </m:t>
-        </m:r>
-        <m:sSup>
-          <m:e>
-            <m:limUpp>
-              <m:e>
-                <m:r>
-                  <m:t>𝐇</m:t>
-                </m:r>
-              </m:e>
-              <m:lim>
-                <m:r>
-                  <m:t>~</m:t>
-                </m:r>
-              </m:lim>
-            </m:limUpp>
-          </m:e>
-          <m:sup>
-            <m:r>
-              <m:rPr>
-                <m:sty m:val="p"/>
-              </m:rPr>
-              <m:t>al</m:t>
-            </m:r>
-          </m:sup>
-        </m:sSup>
-        <m:r>
-          <m:t>(τ)=</m:t>
-        </m:r>
-        <m:limUpp>
-          <m:e>
-            <m:r>
-              <m:t>𝐇</m:t>
-            </m:r>
-          </m:e>
-          <m:lim>
-            <m:r>
-              <m:t>~</m:t>
-            </m:r>
-          </m:lim>
-        </m:limUpp>
-        <m:r>
-          <m:t>(τ)⊙</m:t>
-        </m:r>
-        <m:sSup>
-          <m:e>
-            <m:r>
-              <m:t>𝐮</m:t>
-            </m:r>
-          </m:e>
-          <m:sup>
-            <m:r>
-              <m:t>*</m:t>
-            </m:r>
-          </m:sup>
-        </m:sSup>
-        <m:r>
-          <m:t>,</m:t>
-        </m:r>
-        <m:r>
-          <m:rPr>
-            <m:sty m:val="p"/>
-          </m:rPr>
-          <m:t>      </m:t>
-        </m:r>
-        <m:sSup>
-          <m:e>
-            <m:r>
-              <m:t>𝐒</m:t>
-            </m:r>
-          </m:e>
-          <m:sup>
-            <m:r>
-              <m:rPr>
-                <m:sty m:val="p"/>
-              </m:rPr>
-              <m:t>al</m:t>
-            </m:r>
-          </m:sup>
-        </m:sSup>
-        <m:r>
-          <m:t>(τ)=</m:t>
-        </m:r>
         <m:f>
           <m:fPr>
             <m:type m:val="bar"/>
           </m:fPr>
           <m:num>
-            <m:r>
-              <m:t>s(τ)</m:t>
+            <m:sSub>
+              <m:e>
+                <m:r>
+                  <m:t>g</m:t>
+                </m:r>
+              </m:e>
+              <m:sub>
+                <m:r>
+                  <m:t>e</m:t>
+                </m:r>
+              </m:sub>
+            </m:sSub>
+            <m:r>
+              <m:rPr>
+                <m:sty m:val="p"/>
+              </m:rPr>
+              <m:t> </m:t>
+            </m:r>
+            <m:sSub>
+              <m:e>
+                <m:r>
+                  <m:t>𝐡</m:t>
+                </m:r>
+              </m:e>
+              <m:sub>
+                <m:r>
+                  <m:t>q</m:t>
+                </m:r>
+              </m:sub>
+            </m:sSub>
+            <m:r>
+              <m:t>(i)</m:t>
             </m:r>
           </m:num>
           <m:den>
-            <m:r>
-              <m:t>16</m:t>
+            <m:sSub>
+              <m:e>
+                <m:r>
+                  <m:t>g</m:t>
+                </m:r>
+              </m:e>
+              <m:sub>
+                <m:r>
+                  <m:t>e</m:t>
+                </m:r>
+              </m:sub>
+            </m:sSub>
+            <m:r>
+              <m:rPr>
+                <m:sty m:val="p"/>
+              </m:rPr>
+              <m:t> </m:t>
+            </m:r>
+            <m:sSub>
+              <m:e>
+                <m:r>
+                  <m:t>c</m:t>
+                </m:r>
+              </m:e>
+              <m:sub>
+                <m:r>
+                  <m:t>e</m:t>
+                </m:r>
+              </m:sub>
+            </m:sSub>
+            <m:r>
+              <m:t>(w+</m:t>
+            </m:r>
+            <m:sSub>
+              <m:e>
+                <m:r>
+                  <m:t>T</m:t>
+                </m:r>
+              </m:e>
+              <m:sub>
+                <m:r>
+                  <m:t>p</m:t>
+                </m:r>
+              </m:sub>
+            </m:sSub>
+            <m:r>
+              <m:t>−1)</m:t>
             </m:r>
           </m:den>
         </m:f>
         <m:r>
-          <m:rPr>
-            <m:sty m:val="p"/>
-          </m:rPr>
-          <m:t> </m:t>
+          <m:t>=</m:t>
         </m:r>
         <m:sSub>
           <m:e>
-            <m:r>
-              <m:rPr>
-                <m:sty m:val="b"/>
-              </m:rPr>
-              <m:t>1</m:t>
-            </m:r>
+            <m:bar>
+              <m:barPr>
+                <m:pos m:val="top"/>
+              </m:barPr>
+              <m:e>
+                <m:r>
+                  <m:t>𝐡</m:t>
+                </m:r>
+              </m:e>
+            </m:bar>
           </m:e>
           <m:sub>
             <m:r>
-              <m:t>16×16</m:t>
+              <m:t>q</m:t>
             </m:r>
           </m:sub>
         </m:sSub>
-      </m:oMath>
-    </w:p>
-    <w:p>
-      <w:pPr>
-        <w:spacing w:after="160"/>
-        <w:jc w:val="left"/>
-      </w:pPr>
-      <w:r>
-        <w:rPr>
-          <w:rFonts w:ascii="Consolas" w:hAnsi="Consolas" w:eastAsia="Malgun Gothic"/>
-          <w:color w:val="6E6E6E"/>
-          <w:sz w:val="17"/>
-        </w:rPr>
-        <w:t>\mathbf{u}=16\,\hat{\mathbf{a}},\qquad \tilde{\mathbf{H}}^{\mathrm{al}}(\tau)=\tilde{\mathbf{H}}(\tau)\odot\mathbf{u}^{*},\qquad \mathbf{S}^{\mathrm{al}}(\tau)=\frac{s(\tau)}{16}\,\mathbf{1}_{16\times16}</w:t>
-      </w:r>
-    </w:p>
-    <w:p>
-      <w:pPr>
-        <w:jc w:val="center"/>
-      </w:pPr>
-      <m:oMath>
-        <m:acc>
-          <m:accPr>
-            <m:chr m:val="̂"/>
-          </m:accPr>
-          <m:e>
-            <m:r>
-              <m:t>𝐡</m:t>
-            </m:r>
-          </m:e>
-        </m:acc>
         <m:r>
-          <m:t>(</m:t>
-        </m:r>
-        <m:sSup>
-          <m:e>
-            <m:r>
-              <m:t>i</m:t>
-            </m:r>
-          </m:e>
-          <m:sup>
-            <m:r>
-              <m:t>⋆</m:t>
-            </m:r>
-          </m:sup>
-        </m:sSup>
-        <m:r>
-          <m:t>)=</m:t>
-        </m:r>
-        <m:acc>
-          <m:accPr>
-            <m:chr m:val="̂"/>
-          </m:accPr>
-          <m:e>
-            <m:r>
-              <m:t>s</m:t>
-            </m:r>
-          </m:e>
-        </m:acc>
-        <m:r>
-          <m:t>(</m:t>
-        </m:r>
-        <m:sSup>
-          <m:e>
-            <m:r>
-              <m:t>i</m:t>
-            </m:r>
-          </m:e>
-          <m:sup>
-            <m:r>
-              <m:t>⋆</m:t>
-            </m:r>
-          </m:sup>
-        </m:sSup>
-        <m:r>
-          <m:t>)</m:t>
-        </m:r>
-        <m:r>
-          <m:rPr>
-            <m:sty m:val="p"/>
-          </m:rPr>
-          <m:t> </m:t>
-        </m:r>
-        <m:acc>
-          <m:accPr>
-            <m:chr m:val="̂"/>
-          </m:accPr>
-          <m:e>
-            <m:r>
-              <m:t>𝐚</m:t>
-            </m:r>
-          </m:e>
-        </m:acc>
-        <m:r>
-          <m:t>+</m:t>
-        </m:r>
-        <m:sSub>
-          <m:e>
-            <m:r>
-              <m:t>U</m:t>
-            </m:r>
-          </m:e>
-          <m:sub>
-            <m:r>
-              <m:t>Θ</m:t>
-            </m:r>
-          </m:sub>
-        </m:sSub>
-        <m:d>
-          <m:dPr>
-            <m:sepChr m:val=""/>
-          </m:dPr>
-          <m:e>
-            <m:d>
-              <m:dPr>
-                <m:begChr m:val="["/>
-                <m:sepChr m:val=","/>
-                <m:endChr m:val="]"/>
-              </m:dPr>
-              <m:e>
-                <m:sSup>
-                  <m:e>
-                    <m:limUpp>
-                      <m:e>
-                        <m:r>
-                          <m:t>𝐇</m:t>
-                        </m:r>
-                      </m:e>
-                      <m:lim>
-                        <m:r>
-                          <m:t>~</m:t>
-                        </m:r>
-                      </m:lim>
-                    </m:limUpp>
-                  </m:e>
-                  <m:sup>
-                    <m:r>
-                      <m:rPr>
-                        <m:sty m:val="p"/>
-                      </m:rPr>
-                      <m:t>al</m:t>
-                    </m:r>
-                  </m:sup>
-                </m:sSup>
-              </m:e>
-              <m:e>
-                <m:r>
-                  <m:rPr>
-                    <m:sty m:val="p"/>
-                  </m:rPr>
-                  <m:t> </m:t>
-                </m:r>
-                <m:sSup>
-                  <m:e>
-                    <m:r>
-                      <m:t>𝐒</m:t>
-                    </m:r>
-                  </m:e>
-                  <m:sup>
-                    <m:r>
-                      <m:rPr>
-                        <m:sty m:val="p"/>
-                      </m:rPr>
-                      <m:t>al</m:t>
-                    </m:r>
-                  </m:sup>
-                </m:sSup>
-              </m:e>
-            </m:d>
-          </m:e>
-        </m:d>
-        <m:r>
-          <m:t>⊙𝐮</m:t>
+          <m:t>(i)</m:t>
         </m:r>
       </m:oMath>
     </w:p>
@@ -11275,7 +11006,7 @@
           <w:color w:val="6E6E6E"/>
           <w:sz w:val="17"/>
         </w:rPr>
-        <w:t>\hat{\mathbf{h}}(i^\star)=\hat{s}(i^\star)\,\hat{\mathbf{a}}+U_\Theta\left(\left[\tilde{\mathbf{H}}^{\mathrm{al}},\,\mathbf{S}^{\mathrm{al}}\right]\right)\odot\mathbf{u}</w:t>
+        <w:t>\frac{g_e\,\mathbf{h}_q(i)}{g_e\,c_e(w+T_p-1)}=\bar{\mathbf{h}}_q(i)</w:t>
       </w:r>
     </w:p>
     <w:p>
@@ -11294,7 +11025,7 @@
           <w:color w:val="285AA0"/>
           <w:sz w:val="18"/>
         </w:rPr>
-        <w:t>csi_models.BeamAlignedUNet, train_beam.py --aligned</w:t>
+        <w:t>check_shadow_invariance.py</w:t>
       </w:r>
     </w:p>
     <w:p>
@@ -11302,7 +11033,7 @@
         <w:pStyle w:val="Heading2"/>
       </w:pPr>
       <w:r>
-        <w:t>10.3 방위각 일반화 시험 (v9b 모델)</w:t>
+        <w:t>10.3 방위각 일반화 시험</w:t>
       </w:r>
     </w:p>
     <w:p>
@@ -11311,7 +11042,7 @@
           <w:rFonts w:ascii="Malgun Gothic" w:hAnsi="Malgun Gothic" w:eastAsia="Malgun Gothic"/>
           <w:sz w:val="21"/>
         </w:rPr>
-        <w:t>다른 방위각의 단말은 열 방향 위상 기울기를 곱해 모사한다 (rank-1 구조에서 β 변화와 등가).</w:t>
+        <w:t>다른 방위각의 단말은 열 방향 위상 기울기를 곱해 모사한다 (rank-1 구조에서 β 변화와 등가). 모델·baseline은 방위각 0°(β = 0)로 학습한 그대로다.</w:t>
       </w:r>
     </w:p>
     <w:p>
@@ -11576,7 +11307,7 @@
           <w:color w:val="285AA0"/>
           <w:sz w:val="18"/>
         </w:rPr>
-        <w:t>eval_bearing.py</w:t>
+        <w:t>eval_bearing_final.py</w:t>
       </w:r>
     </w:p>
     <w:p>
@@ -11899,7 +11630,7 @@
                 <w:rFonts w:ascii="Malgun Gothic" w:hAnsi="Malgun Gothic" w:eastAsia="Malgun Gothic"/>
                 <w:sz w:val="19"/>
               </w:rPr>
-              <w:t>s, ŝ, w_l</w:t>
+              <w:t>s, s_p, ŝ, w_l, c</w:t>
             </w:r>
           </w:p>
         </w:tc>
@@ -11914,7 +11645,7 @@
                 <w:rFonts w:ascii="Malgun Gothic" w:hAnsi="Malgun Gothic" w:eastAsia="Malgun Gothic"/>
                 <w:sz w:val="19"/>
               </w:rPr>
-              <w:t>_beam_shortcut, w_re, w_im</w:t>
+              <w:t>BeamShortcutPolyUNet.forward, poly2_extrapolate, w_re, w_im, c_re, c_im</w:t>
             </w:r>
           </w:p>
         </w:tc>
@@ -11963,7 +11694,7 @@
                 <w:rFonts w:ascii="Malgun Gothic" w:hAnsi="Malgun Gothic" w:eastAsia="Malgun Gothic"/>
                 <w:sz w:val="19"/>
               </w:rPr>
-              <w:t>BSC-UNet / BSC-UNet-AI</w:t>
+              <w:t>BSC-UNet-P (제안) / BSC-UNet-I (ablation)</w:t>
             </w:r>
           </w:p>
         </w:tc>
@@ -11978,7 +11709,7 @@
                 <w:rFonts w:ascii="Malgun Gothic" w:hAnsi="Malgun Gothic" w:eastAsia="Malgun Gothic"/>
                 <w:sz w:val="19"/>
               </w:rPr>
-              <w:t>BeamShortcutUNet / BeamAlignedUNet</w:t>
+              <w:t>BeamShortcutPolyUNet / BeamShortcutUNet</w:t>
             </w:r>
           </w:p>
         </w:tc>

</xml_diff>

<commit_message>
Add ManifoldCombo baseline (optimal linear+quadratic shortcut without UNet)
- baselines.py: ManifoldCombo = ridge on [beam-coef history, quadratic extrapolation]
- Re-evaluated final results (k=1-16) and kappa sensitivity with ManifoldCombo
- results_final_tables.md: ablation shows UNet contribution over ManifoldCombo
- Equation document updated

Co-Authored-By: Claude Opus 5.5 <noreply@anthropic.com>
</commit_message>
<xml_diff>
--- a/docs/BSC-UNet_수식정리.docx
+++ b/docs/BSC-UNet_수식정리.docx
@@ -10090,6 +10090,317 @@
           <w:sz w:val="21"/>
         </w:rPr>
         <w:t>ManifoldLinReg: BeamLinReg에서 g ← â (배열 매니폴드 빔, manifold_beam). 선형 지름길만 쓰고 UNet이 없는 구조 (필터를 닫힌 식으로 적합). ManifoldPoly2 (ablation): Poly2_blind에서 g ← â. BSC-UNet-P에서 학습 부분(w, c, UNet)을 모두 뺀 2차 외삽 지름길 (학습 없음).</w:t>
+      </w:r>
+    </w:p>
+    <w:p>
+      <w:r>
+        <w:rPr>
+          <w:rFonts w:ascii="Malgun Gothic" w:hAnsi="Malgun Gothic" w:eastAsia="Malgun Gothic"/>
+          <w:sz w:val="21"/>
+        </w:rPr>
+        <w:t>ManifoldCombo (ablation): BSC-UNet-P의 지름길 입력(빔계수 history + 2차 외삽값)을 UNet 없이 train ridge로 최적 적합한 고전 조합 예측 (α는 val로 k별 선택). BSC-UNet-P와의 차이가 UNet의 순수 기여다.</w:t>
+      </w:r>
+    </w:p>
+    <w:p>
+      <w:pPr>
+        <w:jc w:val="center"/>
+      </w:pPr>
+      <m:oMath>
+        <m:sSub>
+          <m:e>
+            <m:acc>
+              <m:accPr>
+                <m:chr m:val="̂"/>
+              </m:accPr>
+              <m:e>
+                <m:r>
+                  <m:t>s</m:t>
+                </m:r>
+              </m:e>
+            </m:acc>
+          </m:e>
+          <m:sub>
+            <m:r>
+              <m:t>C</m:t>
+            </m:r>
+          </m:sub>
+        </m:sSub>
+        <m:r>
+          <m:t>(</m:t>
+        </m:r>
+        <m:sSup>
+          <m:e>
+            <m:r>
+              <m:t>i</m:t>
+            </m:r>
+          </m:e>
+          <m:sup>
+            <m:r>
+              <m:t>⋆</m:t>
+            </m:r>
+          </m:sup>
+        </m:sSup>
+        <m:r>
+          <m:t>)=</m:t>
+        </m:r>
+        <m:sSup>
+          <m:e>
+            <m:r>
+              <m:t>𝐟</m:t>
+            </m:r>
+          </m:e>
+          <m:sup>
+            <m:r>
+              <m:t>T</m:t>
+            </m:r>
+          </m:sup>
+        </m:sSup>
+        <m:sSubSup>
+          <m:e>
+            <m:r>
+              <m:t>𝐰</m:t>
+            </m:r>
+          </m:e>
+          <m:sub>
+            <m:r>
+              <m:t>k</m:t>
+            </m:r>
+          </m:sub>
+          <m:sup>
+            <m:r>
+              <m:t>C</m:t>
+            </m:r>
+          </m:sup>
+        </m:sSubSup>
+        <m:r>
+          <m:t>,</m:t>
+        </m:r>
+        <m:r>
+          <m:rPr>
+            <m:sty m:val="p"/>
+          </m:rPr>
+          <m:t>      </m:t>
+        </m:r>
+        <m:r>
+          <m:t>𝐟=</m:t>
+        </m:r>
+        <m:sSup>
+          <m:e>
+            <m:d>
+              <m:dPr>
+                <m:begChr m:val="["/>
+                <m:sepChr m:val=""/>
+                <m:endChr m:val="]"/>
+              </m:dPr>
+              <m:e>
+                <m:r>
+                  <m:t>s</m:t>
+                </m:r>
+                <m:r>
+                  <m:t>(</m:t>
+                </m:r>
+                <m:r>
+                  <m:t>w</m:t>
+                </m:r>
+                <m:r>
+                  <m:t>)</m:t>
+                </m:r>
+                <m:r>
+                  <m:t>,</m:t>
+                </m:r>
+                <m:r>
+                  <m:t>…</m:t>
+                </m:r>
+                <m:r>
+                  <m:t>,</m:t>
+                </m:r>
+                <m:r>
+                  <m:t>s</m:t>
+                </m:r>
+                <m:r>
+                  <m:t>(</m:t>
+                </m:r>
+                <m:r>
+                  <m:t>w</m:t>
+                </m:r>
+                <m:r>
+                  <m:t>+</m:t>
+                </m:r>
+                <m:sSub>
+                  <m:e>
+                    <m:r>
+                      <m:t>T</m:t>
+                    </m:r>
+                  </m:e>
+                  <m:sub>
+                    <m:r>
+                      <m:t>p</m:t>
+                    </m:r>
+                  </m:sub>
+                </m:sSub>
+                <m:r>
+                  <m:t>−</m:t>
+                </m:r>
+                <m:r>
+                  <m:t>1</m:t>
+                </m:r>
+                <m:r>
+                  <m:t>)</m:t>
+                </m:r>
+                <m:r>
+                  <m:t>,</m:t>
+                </m:r>
+                <m:r>
+                  <m:rPr>
+                    <m:sty m:val="p"/>
+                  </m:rPr>
+                  <m:t> </m:t>
+                </m:r>
+                <m:sSub>
+                  <m:e>
+                    <m:r>
+                      <m:t>s</m:t>
+                    </m:r>
+                  </m:e>
+                  <m:sub>
+                    <m:r>
+                      <m:t>p</m:t>
+                    </m:r>
+                  </m:sub>
+                </m:sSub>
+                <m:r>
+                  <m:t>(</m:t>
+                </m:r>
+                <m:r>
+                  <m:t>k</m:t>
+                </m:r>
+                <m:r>
+                  <m:t>)</m:t>
+                </m:r>
+              </m:e>
+            </m:d>
+          </m:e>
+          <m:sup>
+            <m:r>
+              <m:t>T</m:t>
+            </m:r>
+          </m:sup>
+        </m:sSup>
+        <m:r>
+          <m:t>,</m:t>
+        </m:r>
+        <m:r>
+          <m:rPr>
+            <m:sty m:val="p"/>
+          </m:rPr>
+          <m:t>      </m:t>
+        </m:r>
+        <m:sSubSup>
+          <m:e>
+            <m:r>
+              <m:t>𝐰</m:t>
+            </m:r>
+          </m:e>
+          <m:sub>
+            <m:r>
+              <m:t>k</m:t>
+            </m:r>
+          </m:sub>
+          <m:sup>
+            <m:r>
+              <m:t>C</m:t>
+            </m:r>
+          </m:sup>
+        </m:sSubSup>
+        <m:r>
+          <m:t>=</m:t>
+        </m:r>
+        <m:r>
+          <m:rPr>
+            <m:sty m:val="p"/>
+          </m:rPr>
+          <m:t>ridge</m:t>
+        </m:r>
+        <m:r>
+          <m:t>(·;α),</m:t>
+        </m:r>
+        <m:r>
+          <m:rPr>
+            <m:sty m:val="p"/>
+          </m:rPr>
+          <m:t>      </m:t>
+        </m:r>
+        <m:sSub>
+          <m:e>
+            <m:acc>
+              <m:accPr>
+                <m:chr m:val="̂"/>
+              </m:accPr>
+              <m:e>
+                <m:r>
+                  <m:t>𝐡</m:t>
+                </m:r>
+              </m:e>
+            </m:acc>
+          </m:e>
+          <m:sub>
+            <m:r>
+              <m:t>C</m:t>
+            </m:r>
+          </m:sub>
+        </m:sSub>
+        <m:r>
+          <m:t>=</m:t>
+        </m:r>
+        <m:sSub>
+          <m:e>
+            <m:acc>
+              <m:accPr>
+                <m:chr m:val="̂"/>
+              </m:accPr>
+              <m:e>
+                <m:r>
+                  <m:t>s</m:t>
+                </m:r>
+              </m:e>
+            </m:acc>
+          </m:e>
+          <m:sub>
+            <m:r>
+              <m:t>C</m:t>
+            </m:r>
+          </m:sub>
+        </m:sSub>
+        <m:r>
+          <m:rPr>
+            <m:sty m:val="p"/>
+          </m:rPr>
+          <m:t> </m:t>
+        </m:r>
+        <m:acc>
+          <m:accPr>
+            <m:chr m:val="̂"/>
+          </m:accPr>
+          <m:e>
+            <m:r>
+              <m:t>𝐚</m:t>
+            </m:r>
+          </m:e>
+        </m:acc>
+      </m:oMath>
+    </w:p>
+    <w:p>
+      <w:pPr>
+        <w:spacing w:after="160"/>
+        <w:jc w:val="left"/>
+      </w:pPr>
+      <w:r>
+        <w:rPr>
+          <w:rFonts w:ascii="Consolas" w:hAnsi="Consolas" w:eastAsia="Malgun Gothic"/>
+          <w:color w:val="6E6E6E"/>
+          <w:sz w:val="17"/>
+        </w:rPr>
+        <w:t>\hat{s}_{\mathrm{C}}(i^\star)=\mathbf{f}^{T}\mathbf{w}_k^{\mathrm{C}},\qquad \mathbf{f}=\left[s(w),\dots,s(w+T_p-1),\,s_{\mathrm{p}}(k)\right]^{T},\qquad \mathbf{w}_k^{\mathrm{C}}=\mathrm{ridge}(\cdot;\alpha),\qquad \hat{\mathbf{h}}_{\mathrm{C}}=\hat{s}_{\mathrm{C}}\,\hat{\mathbf{a}}</w:t>
       </w:r>
     </w:p>
     <w:p>

</xml_diff>

<commit_message>
Switch main results to kappa=1 (uncompensated Doppler rate); kappa=0.155 as sensitivity
- BSC-UNet-P and BSC-UNet-I trained with --doppler_rate_kappa 1 (k=1-16); kappa=1 eval + bearing test
- make_tables_final.py --kappa {1,0.155}: results_final_tables.md (main), results_kappa0155_tables.md
- UNet-only ablation at kappa=0.155 for all horizons; eval_bearing_final.py --doppler_rate_kappa
- Equation document: kappa=1 main, kappa_gen=0.1551 implementation note

Co-Authored-By: Claude Opus 5.5 <noreply@anthropic.com>
</commit_message>
<xml_diff>
--- a/docs/BSC-UNet_수식정리.docx
+++ b/docs/BSC-UNet_수식정리.docx
@@ -3628,7 +3628,7 @@
           <w:rFonts w:ascii="Malgun Gothic" w:hAnsi="Malgun Gothic" w:eastAsia="Malgun Gothic"/>
           <w:sz w:val="21"/>
         </w:rPr>
-        <w:t>미분은 Δθ = 10⁻⁵ rad 중앙 차분이다. 구현은 에피소드 말미 잔차 순간주파수가 150 Hz를 넘지 않도록 최악 조건 ε = 90° 기준 전역 스케일 κ를 한 번만 정해 모든 에피소드에 같은 비율로 적용한다 (고각별 상대 차이 보존, ḟ_D^raw(90°) = −6449.3 Hz/s). κ는 궤도 정보 기반 보상과 수신기 주파수 추적 후 남는 Doppler 변화율 잔차의 크기를 정하는 모델링 선택이며, κ = 1(보상 없는 실제 변화율) 조건의 민감도 분석을 10.1절에 함께 보고한다. π ḟ_D t²는 선형 위상 램프(상수 회전)로 제거되지 않는 2차 위상이다.</w:t>
+        <w:t>미분은 Δθ = 10⁻⁵ rad 중앙 차분이다 (ḟ_D^raw(90°) = −6449.3 Hz/s). 주 결과는 Doppler 변화율 잔차를 보상하지 않은 실제 크기(κ = 1, 에피소드 시작 시점의 Doppler만 사전보상)를 쓴다. 변화율 잔차의 일부만 남는 부분 보상 가정(κ = 0.155)은 민감도로 함께 보고한다 (10.1절). π ḟ_D t²는 선형 위상 램프(상수 회전)로 제거되지 않는 2차 위상이다.</w:t>
       </w:r>
     </w:p>
     <w:p>
@@ -3636,8 +3636,184 @@
         <w:jc w:val="center"/>
       </w:pPr>
       <m:oMath>
+        <m:sSub>
+          <m:e>
+            <m:limUpp>
+              <m:e>
+                <m:r>
+                  <m:t>f</m:t>
+                </m:r>
+              </m:e>
+              <m:lim>
+                <m:r>
+                  <m:t>˙</m:t>
+                </m:r>
+              </m:lim>
+            </m:limUpp>
+          </m:e>
+          <m:sub>
+            <m:r>
+              <m:t>D</m:t>
+            </m:r>
+          </m:sub>
+        </m:sSub>
         <m:r>
-          <m:t>κ=min</m:t>
+          <m:t>=κ</m:t>
+        </m:r>
+        <m:r>
+          <m:rPr>
+            <m:sty m:val="p"/>
+          </m:rPr>
+          <m:t> </m:t>
+        </m:r>
+        <m:sSubSup>
+          <m:e>
+            <m:limUpp>
+              <m:e>
+                <m:r>
+                  <m:t>f</m:t>
+                </m:r>
+              </m:e>
+              <m:lim>
+                <m:r>
+                  <m:t>˙</m:t>
+                </m:r>
+              </m:lim>
+            </m:limUpp>
+          </m:e>
+          <m:sub>
+            <m:r>
+              <m:t>D</m:t>
+            </m:r>
+          </m:sub>
+          <m:sup>
+            <m:r>
+              <m:rPr>
+                <m:sty m:val="p"/>
+              </m:rPr>
+              <m:t>raw</m:t>
+            </m:r>
+          </m:sup>
+        </m:sSubSup>
+        <m:r>
+          <m:t>(</m:t>
+        </m:r>
+        <m:sSub>
+          <m:e>
+            <m:r>
+              <m:t>ε</m:t>
+            </m:r>
+          </m:e>
+          <m:sub>
+            <m:r>
+              <m:t>e</m:t>
+            </m:r>
+          </m:sub>
+        </m:sSub>
+        <m:r>
+          <m:t>),</m:t>
+        </m:r>
+        <m:r>
+          <m:rPr>
+            <m:sty m:val="p"/>
+          </m:rPr>
+          <m:t>      </m:t>
+        </m:r>
+        <m:r>
+          <m:t>κ=1</m:t>
+        </m:r>
+        <m:r>
+          <m:rPr>
+            <m:sty m:val="p"/>
+          </m:rPr>
+          <m:t> </m:t>
+        </m:r>
+        <m:r>
+          <m:t>(</m:t>
+        </m:r>
+        <m:r>
+          <m:rPr>
+            <m:nor/>
+          </m:rPr>
+          <m:t>main</m:t>
+        </m:r>
+        <m:r>
+          <m:t>),</m:t>
+        </m:r>
+        <m:r>
+          <m:rPr>
+            <m:sty m:val="p"/>
+          </m:rPr>
+          <m:t>   </m:t>
+        </m:r>
+        <m:r>
+          <m:t>κ=0.1551</m:t>
+        </m:r>
+        <m:r>
+          <m:rPr>
+            <m:sty m:val="p"/>
+          </m:rPr>
+          <m:t> </m:t>
+        </m:r>
+        <m:r>
+          <m:t>(</m:t>
+        </m:r>
+        <m:r>
+          <m:rPr>
+            <m:nor/>
+          </m:rPr>
+          <m:t>sensitivity</m:t>
+        </m:r>
+        <m:r>
+          <m:t>)</m:t>
+        </m:r>
+      </m:oMath>
+    </w:p>
+    <w:p>
+      <w:pPr>
+        <w:spacing w:after="160"/>
+        <w:jc w:val="left"/>
+      </w:pPr>
+      <w:r>
+        <w:rPr>
+          <w:rFonts w:ascii="Consolas" w:hAnsi="Consolas" w:eastAsia="Malgun Gothic"/>
+          <w:color w:val="6E6E6E"/>
+          <w:sz w:val="17"/>
+        </w:rPr>
+        <w:t>\dot{f}_D=\kappa\,\dot{f}_D^{\mathrm{raw}}(\varepsilon_e),\qquad \kappa=1\ (\text{main}),\quad \kappa=0.1551\ (\text{sensitivity})</w:t>
+      </w:r>
+    </w:p>
+    <w:p>
+      <w:r>
+        <w:rPr>
+          <w:rFonts w:ascii="Malgun Gothic" w:hAnsi="Malgun Gothic" w:eastAsia="Malgun Gothic"/>
+          <w:sz w:val="21"/>
+        </w:rPr>
+        <w:t>구현 메모: 생성기는 에피소드 말미 잔차 순간주파수 150 Hz 상한으로 정한 전역 스케일 κ = 0.1551로 저장했고(아래 식), κ = 1 데이터는 로더에서 빠진 2차 위상을 곱해 정확히 복원한다 (10.1절).</w:t>
+      </w:r>
+    </w:p>
+    <w:p>
+      <w:pPr>
+        <w:jc w:val="center"/>
+      </w:pPr>
+      <m:oMath>
+        <m:sSub>
+          <m:e>
+            <m:r>
+              <m:t>κ</m:t>
+            </m:r>
+          </m:e>
+          <m:sub>
+            <m:r>
+              <m:rPr>
+                <m:sty m:val="p"/>
+              </m:rPr>
+              <m:t>gen</m:t>
+            </m:r>
+          </m:sub>
+        </m:sSub>
+        <m:r>
+          <m:t>=min</m:t>
         </m:r>
         <m:d>
           <m:dPr>
@@ -3741,90 +3917,7 @@
           </m:e>
         </m:d>
         <m:r>
-          <m:t>=0.1551,</m:t>
-        </m:r>
-        <m:r>
-          <m:rPr>
-            <m:sty m:val="p"/>
-          </m:rPr>
-          <m:t>      </m:t>
-        </m:r>
-        <m:sSub>
-          <m:e>
-            <m:limUpp>
-              <m:e>
-                <m:r>
-                  <m:t>f</m:t>
-                </m:r>
-              </m:e>
-              <m:lim>
-                <m:r>
-                  <m:t>˙</m:t>
-                </m:r>
-              </m:lim>
-            </m:limUpp>
-          </m:e>
-          <m:sub>
-            <m:r>
-              <m:t>D</m:t>
-            </m:r>
-          </m:sub>
-        </m:sSub>
-        <m:r>
-          <m:t>=κ</m:t>
-        </m:r>
-        <m:r>
-          <m:rPr>
-            <m:sty m:val="p"/>
-          </m:rPr>
-          <m:t> </m:t>
-        </m:r>
-        <m:sSubSup>
-          <m:e>
-            <m:limUpp>
-              <m:e>
-                <m:r>
-                  <m:t>f</m:t>
-                </m:r>
-              </m:e>
-              <m:lim>
-                <m:r>
-                  <m:t>˙</m:t>
-                </m:r>
-              </m:lim>
-            </m:limUpp>
-          </m:e>
-          <m:sub>
-            <m:r>
-              <m:t>D</m:t>
-            </m:r>
-          </m:sub>
-          <m:sup>
-            <m:r>
-              <m:rPr>
-                <m:sty m:val="p"/>
-              </m:rPr>
-              <m:t>raw</m:t>
-            </m:r>
-          </m:sup>
-        </m:sSubSup>
-        <m:r>
-          <m:t>(</m:t>
-        </m:r>
-        <m:sSub>
-          <m:e>
-            <m:r>
-              <m:t>ε</m:t>
-            </m:r>
-          </m:e>
-          <m:sub>
-            <m:r>
-              <m:t>e</m:t>
-            </m:r>
-          </m:sub>
-        </m:sSub>
-        <m:r>
-          <m:t>)</m:t>
+          <m:t>=0.1551</m:t>
         </m:r>
       </m:oMath>
     </w:p>
@@ -3839,7 +3932,7 @@
           <w:color w:val="6E6E6E"/>
           <w:sz w:val="17"/>
         </w:rPr>
-        <w:t>\kappa=\min\left(1,\ \frac{150\ \mathrm{Hz}}{|\dot{f}_D^{\mathrm{raw}}(90^\circ)|\cdot 0.15\ \mathrm{s}}\right)=0.1551,\qquad \dot{f}_D=\kappa\,\dot{f}_D^{\mathrm{raw}}(\varepsilon_e)</w:t>
+        <w:t>\kappa_{\mathrm{gen}}=\min\left(1,\ \frac{150\ \mathrm{Hz}}{|\dot{f}_D^{\mathrm{raw}}(90^\circ)|\cdot 0.15\ \mathrm{s}}\right)=0.1551</w:t>
       </w:r>
     </w:p>
     <w:p>
@@ -10975,7 +11068,7 @@
           <w:rFonts w:ascii="Malgun Gothic" w:hAnsi="Malgun Gothic" w:eastAsia="Malgun Gothic"/>
           <w:sz w:val="21"/>
         </w:rPr>
-        <w:t>κ = 1(보상 없는 실제 변화율) 데이터는 재생성 없이 저장된 채널에 빠진 2차 위상을 곱해 만든다 (모든 안테나·부반송파 공통 위상이라 정확). baseline은 κ = 1 train/val로 다시 적합하고, 모델은 κ = 1 데이터로 다시 학습한다.</w:t>
+        <w:t>주 결과(κ = 1) 데이터는 재생성 없이 저장된 채널(κ_gen = 0.1551)에 빠진 2차 위상을 곱해 만든다 (모든 안테나·부반송파 공통 위상이라 정확). 민감도(κ = 0.155)는 저장된 채널을 그대로 쓴다. 각 조건에서 baseline은 같은 κ의 train/val로 적합하고, 모델은 같은 κ 데이터로 학습한다.</w:t>
       </w:r>
     </w:p>
     <w:p>
@@ -11053,7 +11146,7 @@
             <m:r>
               <m:t>π</m:t>
             </m:r>
-            <m:sSub>
+            <m:sSubSup>
               <m:e>
                 <m:limUpp>
                   <m:e>
@@ -11073,7 +11166,15 @@
                   <m:t>D</m:t>
                 </m:r>
               </m:sub>
-            </m:sSub>
+              <m:sup>
+                <m:r>
+                  <m:rPr>
+                    <m:sty m:val="p"/>
+                  </m:rPr>
+                  <m:t>gen</m:t>
+                </m:r>
+              </m:sup>
+            </m:sSubSup>
             <m:d>
               <m:dPr>
                 <m:sepChr m:val="−"/>
@@ -11089,9 +11190,21 @@
                     </m:r>
                   </m:num>
                   <m:den>
-                    <m:r>
-                      <m:t>κ</m:t>
-                    </m:r>
+                    <m:sSub>
+                      <m:e>
+                        <m:r>
+                          <m:t>κ</m:t>
+                        </m:r>
+                      </m:e>
+                      <m:sub>
+                        <m:r>
+                          <m:rPr>
+                            <m:sty m:val="p"/>
+                          </m:rPr>
+                          <m:t>gen</m:t>
+                        </m:r>
+                      </m:sub>
+                    </m:sSub>
                   </m:den>
                 </m:f>
               </m:e>
@@ -11129,9 +11242,82 @@
           </m:rPr>
           <m:t>      </m:t>
         </m:r>
+        <m:sSubSup>
+          <m:e>
+            <m:limUpp>
+              <m:e>
+                <m:r>
+                  <m:t>f</m:t>
+                </m:r>
+              </m:e>
+              <m:lim>
+                <m:r>
+                  <m:t>˙</m:t>
+                </m:r>
+              </m:lim>
+            </m:limUpp>
+          </m:e>
+          <m:sub>
+            <m:r>
+              <m:t>D</m:t>
+            </m:r>
+          </m:sub>
+          <m:sup>
+            <m:r>
+              <m:rPr>
+                <m:sty m:val="p"/>
+              </m:rPr>
+              <m:t>gen</m:t>
+            </m:r>
+          </m:sup>
+        </m:sSubSup>
         <m:r>
-          <m:t>κ=0.1551</m:t>
+          <m:t>=</m:t>
         </m:r>
+        <m:sSub>
+          <m:e>
+            <m:r>
+              <m:t>κ</m:t>
+            </m:r>
+          </m:e>
+          <m:sub>
+            <m:r>
+              <m:rPr>
+                <m:sty m:val="p"/>
+              </m:rPr>
+              <m:t>gen</m:t>
+            </m:r>
+          </m:sub>
+        </m:sSub>
+        <m:sSubSup>
+          <m:e>
+            <m:limUpp>
+              <m:e>
+                <m:r>
+                  <m:t>f</m:t>
+                </m:r>
+              </m:e>
+              <m:lim>
+                <m:r>
+                  <m:t>˙</m:t>
+                </m:r>
+              </m:lim>
+            </m:limUpp>
+          </m:e>
+          <m:sub>
+            <m:r>
+              <m:t>D</m:t>
+            </m:r>
+          </m:sub>
+          <m:sup>
+            <m:r>
+              <m:rPr>
+                <m:sty m:val="p"/>
+              </m:rPr>
+              <m:t>raw</m:t>
+            </m:r>
+          </m:sup>
+        </m:sSubSup>
       </m:oMath>
     </w:p>
     <w:p>
@@ -11145,7 +11331,7 @@
           <w:color w:val="6E6E6E"/>
           <w:sz w:val="17"/>
         </w:rPr>
-        <w:t>\mathbf{h}_q^{(\kappa=1)}(i)=\mathbf{h}_q(i)\,\exp\left(j\pi\dot{f}_D\left(\frac{1}{\kappa}-1\right)t_i^2\right),\qquad \kappa=0.1551</w:t>
+        <w:t>\mathbf{h}_q^{(\kappa=1)}(i)=\mathbf{h}_q(i)\,\exp\left(j\pi\dot{f}_D^{\mathrm{gen}}\left(\frac{1}{\kappa_{\mathrm{gen}}}-1\right)t_i^2\right),\qquad \dot{f}_D^{\mathrm{gen}}=\kappa_{\mathrm{gen}}\dot{f}_D^{\mathrm{raw}}</w:t>
       </w:r>
     </w:p>
     <w:p>

</xml_diff>